<commit_message>
Hoan thien thiet ke cho buoi hop: kien truc, class, sequence, activity, dac ta use case, doi chieu thiet ke, cau hoi bao ve
</commit_message>
<xml_diff>
--- a/docs/architecture/Kien_Truc_He_Thong.docx
+++ b/docs/architecture/Kien_Truc_He_Thong.docx
@@ -47,7 +47,7 @@
           <w:sz w:val="20"/>
           <w:szCs w:val="20"/>
         </w:rPr>
-        <w:t xml:space="preserve">Sprint 2 — EP2: Thiết kế hệ thống  |  Cập nhật: 09/2026</w:t>
+        <w:t>Sprint 2 — EP2: Thiết kế hệ thống  |  Cập nhật: 10/2026 (rubric đa chiều, chấm bất đồng bộ, đặt lại mật khẩu)</w:t>
       </w:r>
     </w:p>
     <w:p>
@@ -70,6 +70,7 @@
     <w:p>
       <w:pPr>
         <w:pStyle w:val="Heading1"/>
+        <w:keepNext/>
         <w:spacing w:after="150" w:before="340"/>
       </w:pPr>
       <w:r>
@@ -386,7 +387,7 @@
                 <w:sz w:val="20"/>
                 <w:szCs w:val="20"/>
               </w:rPr>
-              <w:t xml:space="preserve">Hỗ trợ JSONB cho dữ liệu điểm STAR linh hoạt</w:t>
+              <w:t>Hỗ trợ JSONB cho dữ liệu linh hoạt (điểm từng tiêu chí rubric lưu ở bảng score_criteria, xem ERD.md)</w:t>
             </w:r>
           </w:p>
         </w:tc>
@@ -817,10 +818,224 @@
           </w:p>
         </w:tc>
       </w:tr>
+      <w:tr>
+        <w:tc>
+          <w:tcPr>
+            <w:tcW w:type="dxa" w:w="2600"/>
+            <w:tcMar>
+              <w:top w:type="dxa" w:w="70"/>
+              <w:left w:type="dxa" w:w="90"/>
+              <w:bottom w:type="dxa" w:w="70"/>
+              <w:right w:type="dxa" w:w="90"/>
+            </w:tcMar>
+          </w:tcPr>
+          <w:p>
+            <w:r>
+              <w:rPr>
+                <w:rFonts w:ascii="Calibri" w:cs="Calibri" w:eastAsia="Calibri" w:hAnsi="Calibri"/>
+                <w:b w:val="false"/>
+                <w:bCs w:val="false"/>
+                <w:sz w:val="20"/>
+                <w:szCs w:val="20"/>
+              </w:rPr>
+              <w:t>Gửi email</w:t>
+            </w:r>
+          </w:p>
+        </w:tc>
+        <w:tc>
+          <w:tcPr>
+            <w:tcW w:type="dxa" w:w="4200"/>
+            <w:tcMar>
+              <w:top w:type="dxa" w:w="70"/>
+              <w:left w:type="dxa" w:w="90"/>
+              <w:bottom w:type="dxa" w:w="70"/>
+              <w:right w:type="dxa" w:w="90"/>
+            </w:tcMar>
+          </w:tcPr>
+          <w:p>
+            <w:r>
+              <w:rPr>
+                <w:rFonts w:ascii="Calibri" w:cs="Calibri" w:eastAsia="Calibri" w:hAnsi="Calibri"/>
+                <w:b w:val="false"/>
+                <w:bCs w:val="false"/>
+                <w:sz w:val="20"/>
+                <w:szCs w:val="20"/>
+              </w:rPr>
+              <w:t>SMTP (Spring Mail)</w:t>
+            </w:r>
+          </w:p>
+        </w:tc>
+        <w:tc>
+          <w:tcPr>
+            <w:tcW w:type="dxa" w:w="2400"/>
+            <w:tcMar>
+              <w:top w:type="dxa" w:w="70"/>
+              <w:left w:type="dxa" w:w="90"/>
+              <w:bottom w:type="dxa" w:w="70"/>
+              <w:right w:type="dxa" w:w="90"/>
+            </w:tcMar>
+          </w:tcPr>
+          <w:p>
+            <w:r>
+              <w:rPr>
+                <w:rFonts w:ascii="Calibri" w:cs="Calibri" w:eastAsia="Calibri" w:hAnsi="Calibri"/>
+                <w:b w:val="false"/>
+                <w:bCs w:val="false"/>
+                <w:sz w:val="20"/>
+                <w:szCs w:val="20"/>
+              </w:rPr>
+              <w:t>Email đặt lại mật khẩu, qua MailService (adapter)</w:t>
+            </w:r>
+          </w:p>
+        </w:tc>
+      </w:tr>
+      <w:tr>
+        <w:tc>
+          <w:tcPr>
+            <w:tcW w:type="dxa" w:w="2600"/>
+            <w:tcMar>
+              <w:top w:type="dxa" w:w="70"/>
+              <w:left w:type="dxa" w:w="90"/>
+              <w:bottom w:type="dxa" w:w="70"/>
+              <w:right w:type="dxa" w:w="90"/>
+            </w:tcMar>
+          </w:tcPr>
+          <w:p>
+            <w:r>
+              <w:rPr>
+                <w:rFonts w:ascii="Calibri" w:cs="Calibri" w:eastAsia="Calibri" w:hAnsi="Calibri"/>
+                <w:b w:val="false"/>
+                <w:bCs w:val="false"/>
+                <w:sz w:val="20"/>
+                <w:szCs w:val="20"/>
+              </w:rPr>
+              <w:t>Xử lý nền</w:t>
+            </w:r>
+          </w:p>
+        </w:tc>
+        <w:tc>
+          <w:tcPr>
+            <w:tcW w:type="dxa" w:w="4200"/>
+            <w:tcMar>
+              <w:top w:type="dxa" w:w="70"/>
+              <w:left w:type="dxa" w:w="90"/>
+              <w:bottom w:type="dxa" w:w="70"/>
+              <w:right w:type="dxa" w:w="90"/>
+            </w:tcMar>
+          </w:tcPr>
+          <w:p>
+            <w:r>
+              <w:rPr>
+                <w:rFonts w:ascii="Calibri" w:cs="Calibri" w:eastAsia="Calibri" w:hAnsi="Calibri"/>
+                <w:b w:val="false"/>
+                <w:bCs w:val="false"/>
+                <w:sz w:val="20"/>
+                <w:szCs w:val="20"/>
+              </w:rPr>
+              <w:t>Spring @Async + ThreadPoolTaskExecutor</w:t>
+            </w:r>
+          </w:p>
+        </w:tc>
+        <w:tc>
+          <w:tcPr>
+            <w:tcW w:type="dxa" w:w="2400"/>
+            <w:tcMar>
+              <w:top w:type="dxa" w:w="70"/>
+              <w:left w:type="dxa" w:w="90"/>
+              <w:bottom w:type="dxa" w:w="70"/>
+              <w:right w:type="dxa" w:w="90"/>
+            </w:tcMar>
+          </w:tcPr>
+          <w:p>
+            <w:r>
+              <w:rPr>
+                <w:rFonts w:ascii="Calibri" w:cs="Calibri" w:eastAsia="Calibri" w:hAnsi="Calibri"/>
+                <w:b w:val="false"/>
+                <w:bCs w:val="false"/>
+                <w:sz w:val="20"/>
+                <w:szCs w:val="20"/>
+              </w:rPr>
+              <w:t>Chấm điểm bất đồng bộ trong cùng tiến trình, không dùng hàng đợi ngoài</w:t>
+            </w:r>
+          </w:p>
+        </w:tc>
+      </w:tr>
+      <w:tr>
+        <w:tc>
+          <w:tcPr>
+            <w:tcW w:type="dxa" w:w="2600"/>
+            <w:tcMar>
+              <w:top w:type="dxa" w:w="70"/>
+              <w:left w:type="dxa" w:w="90"/>
+              <w:bottom w:type="dxa" w:w="70"/>
+              <w:right w:type="dxa" w:w="90"/>
+            </w:tcMar>
+          </w:tcPr>
+          <w:p>
+            <w:r>
+              <w:rPr>
+                <w:rFonts w:ascii="Calibri" w:cs="Calibri" w:eastAsia="Calibri" w:hAnsi="Calibri"/>
+                <w:b w:val="false"/>
+                <w:bCs w:val="false"/>
+                <w:sz w:val="20"/>
+                <w:szCs w:val="20"/>
+              </w:rPr>
+              <w:t>Migration CSDL</w:t>
+            </w:r>
+          </w:p>
+        </w:tc>
+        <w:tc>
+          <w:tcPr>
+            <w:tcW w:type="dxa" w:w="4200"/>
+            <w:tcMar>
+              <w:top w:type="dxa" w:w="70"/>
+              <w:left w:type="dxa" w:w="90"/>
+              <w:bottom w:type="dxa" w:w="70"/>
+              <w:right w:type="dxa" w:w="90"/>
+            </w:tcMar>
+          </w:tcPr>
+          <w:p>
+            <w:r>
+              <w:rPr>
+                <w:rFonts w:ascii="Calibri" w:cs="Calibri" w:eastAsia="Calibri" w:hAnsi="Calibri"/>
+                <w:b w:val="false"/>
+                <w:bCs w:val="false"/>
+                <w:sz w:val="20"/>
+                <w:szCs w:val="20"/>
+              </w:rPr>
+              <w:t>Flyway</w:t>
+            </w:r>
+          </w:p>
+        </w:tc>
+        <w:tc>
+          <w:tcPr>
+            <w:tcW w:type="dxa" w:w="2400"/>
+            <w:tcMar>
+              <w:top w:type="dxa" w:w="70"/>
+              <w:left w:type="dxa" w:w="90"/>
+              <w:bottom w:type="dxa" w:w="70"/>
+              <w:right w:type="dxa" w:w="90"/>
+            </w:tcMar>
+          </w:tcPr>
+          <w:p>
+            <w:r>
+              <w:rPr>
+                <w:rFonts w:ascii="Calibri" w:cs="Calibri" w:eastAsia="Calibri" w:hAnsi="Calibri"/>
+                <w:b w:val="false"/>
+                <w:bCs w:val="false"/>
+                <w:sz w:val="20"/>
+                <w:szCs w:val="20"/>
+              </w:rPr>
+              <w:t>Script db/migration/V1__init.sql; Hibernate chỉ validate schema</w:t>
+            </w:r>
+          </w:p>
+        </w:tc>
+      </w:tr>
     </w:tbl>
     <w:p>
       <w:pPr>
         <w:pStyle w:val="Heading1"/>
+        <w:keepNext/>
         <w:spacing w:after="150" w:before="340"/>
       </w:pPr>
       <w:r>
@@ -866,12 +1081,30 @@
           <w:sz w:val="22"/>
           <w:szCs w:val="22"/>
         </w:rPr>
-        <w:t xml:space="preserve">Phần xử lý AI (STT/LLM/TTS) được tách thành các service riêng theo Adapter Pattern: tầng Service nghiệp vụ không gọi trực tiếp API bên ngoài, mà thông qua một lớp trung gian (SttService, LlmService, TtsService). Mục đích: đổi nhà cung cấp AI sau này (nếu cần) chỉ sửa trong adapter, không đụng đến logic nghiệp vụ.</w:t>
+        <w:t>Phần xử lý AI (STT/LLM/TTS) được tách thành các service riêng theo Adapter Pattern: tầng Service nghiệp vụ không gọi trực tiếp API bên ngoài, mà thông qua một lớp trung gian (SttService, LlmService, TtsService, MailService, FileStorageService). Mục đích: đổi nhà cung cấp AI sau này (nếu cần) chỉ sửa trong adapter, không đụng đến logic nghiệp vụ.</w:t>
+      </w:r>
+    </w:p>
+    <w:p>
+      <w:pPr>
+        <w:spacing w:after="100"/>
+      </w:pPr>
+      <w:r>
+        <w:rPr>
+          <w:rFonts w:ascii="Calibri" w:cs="Calibri" w:eastAsia="Calibri" w:hAnsi="Calibri"/>
+          <w:b w:val="false"/>
+          <w:bCs w:val="false"/>
+          <w:i w:val="false"/>
+          <w:iCs w:val="false"/>
+          <w:sz w:val="22"/>
+          <w:szCs w:val="22"/>
+        </w:rPr>
+        <w:t>Các sơ đồ minh họa nằm ở Phụ lục A: Hình 1 – kiến trúc tổng thể; Hình 2 – thành phần theo tầng; Hình 3 – triển khai; Hình 4 – luồng chấm điểm bất đồng bộ; Hình 5 – bảo mật JWT/RBAC.</w:t>
       </w:r>
     </w:p>
     <w:p>
       <w:pPr>
         <w:pStyle w:val="Heading2"/>
+        <w:keepNext/>
         <w:spacing w:after="100" w:before="220"/>
       </w:pPr>
       <w:r>
@@ -1046,7 +1279,7 @@
                 <w:sz w:val="20"/>
                 <w:szCs w:val="20"/>
               </w:rPr>
-              <w:t xml:space="preserve">Xử lý logic nghiệp vụ chính: điều phối gọi AI qua adapter, tính toán, áp dụng Business Rule (ví dụ B4 — chấm điểm 1 lần, temperature thấp, chấm và giải thích riêng từng tiêu chí STAR), gọi Repository để đọc/ghi dữ liệu.</w:t>
+              <w:t>Xử lý logic nghiệp vụ chính: điều phối gọi AI qua adapter, tính toán, áp dụng Business Rule (ví dụ B4 — chấm điểm 1 lần, temperature thấp, chấm và giải thích riêng từng tiêu chí rubric), gọi Repository để đọc/ghi dữ liệu.</w:t>
             </w:r>
           </w:p>
         </w:tc>
@@ -1151,6 +1384,7 @@
     <w:p>
       <w:pPr>
         <w:pStyle w:val="Heading2"/>
+        <w:keepNext/>
         <w:spacing w:after="100" w:before="220"/>
       </w:pPr>
       <w:r>
@@ -1279,7 +1513,7 @@
           <w:sz w:val="22"/>
           <w:szCs w:val="22"/>
         </w:rPr>
-        <w:t xml:space="preserve">Chấm điểm gọi LLM đúng 1 lần (đảo ngược quyết định gọi 2 lần lấy trung bình ban đầu — gấp đôi chi phí/độ trễ không hợp lý cho mức cải thiện độ lệch ±4/50 điểm); thay bằng temperature thấp + chấm, giải thích riêng từng tiêu chí STAR trước khi tổng hợp điểm, cộng cơ chế timeout 15s + tự động gọi lại 1 lần khi lỗi (DLPVXVTHA-102, xem Business Rule B4 trong đặc tả UC5).</w:t>
+        <w:t>Chấm điểm gọi LLM đúng 1 lần (đảo ngược quyết định gọi 2 lần lấy trung bình ban đầu — gấp đôi chi phí/độ trễ không hợp lý cho mức cải thiện độ lệch ±4/50 điểm); thay bằng temperature thấp + chấm, giải thích riêng từng tiêu chí rubric (kèm trích dẫn nguyên văn) trước khi hệ thống tự tính điểm tổng, cộng cơ chế timeout 15s + tự động gọi lại 1 lần khi lỗi (DLPVXVTHA-102, xem Business Rule B4 trong đặc tả UC5).</w:t>
       </w:r>
     </w:p>
     <w:p>
@@ -1299,24 +1533,105 @@
           <w:sz w:val="22"/>
           <w:szCs w:val="22"/>
         </w:rPr>
-        <w:t xml:space="preserve">NF1 (thời gian phản hồi) chốt ở ngưỡng ≤ 12 giây, không phải 8 giây như dự kiến ban đầu — dựa trên đo thực nghiệm 14 mẫu audio 10-131 giây.</w:t>
-      </w:r>
-    </w:p>
-    <w:p>
-      <w:pPr>
-        <w:pStyle w:val="Heading1"/>
-        <w:spacing w:after="150" w:before="340"/>
+        <w:t>NF1 (thời gian phản hồi): API chấm điểm trả 202 trong ≤ 1 giây; tổng thời gian từ lúc nộp audio đến khi có kết quả ≤ 12 giây (chốt ở 12 giây thay vì 8 giây ban đầu, dựa trên đo thực nghiệm 14 mẫu audio 10-131 giây).</w:t>
+      </w:r>
+    </w:p>
+    <w:p>
+      <w:pPr>
+        <w:pStyle w:val="ListParagraph"/>
+        <w:numPr>
+          <w:ilvl w:val="0"/>
+          <w:numId w:val="2"/>
+        </w:numPr>
+        <w:spacing w:after="60"/>
+      </w:pPr>
+      <w:r>
+        <w:rPr>
+          <w:rFonts w:ascii="Calibri" w:cs="Calibri" w:eastAsia="Calibri" w:hAnsi="Calibri"/>
+          <w:b w:val="false"/>
+          <w:bCs w:val="false"/>
+          <w:sz w:val="22"/>
+          <w:szCs w:val="22"/>
+        </w:rPr>
+        <w:t>Chấm điểm chạy bất đồng bộ (202 Accepted + polling): STT từng mất 83 giây và Render có thể cold start nên không giữ một request HTTP chờ kết quả. Thực thi bằng ThreadPoolTaskExecutor trong cùng tiến trình; khi khởi động lại, session PROCESSING quá hạn được đánh dấu FAILED (SERVER_RESTART) để người dùng chấm lại.</w:t>
+      </w:r>
+    </w:p>
+    <w:p>
+      <w:pPr>
+        <w:pStyle w:val="ListParagraph"/>
+        <w:numPr>
+          <w:ilvl w:val="0"/>
+          <w:numId w:val="2"/>
+        </w:numPr>
+        <w:spacing w:after="60"/>
+      </w:pPr>
+      <w:r>
+        <w:rPr>
+          <w:rFonts w:ascii="Calibri" w:cs="Calibri" w:eastAsia="Calibri" w:hAnsi="Calibri"/>
+          <w:b w:val="false"/>
+          <w:bCs w:val="false"/>
+          <w:sz w:val="22"/>
+          <w:szCs w:val="22"/>
+        </w:rPr>
+        <w:t>Điểm tổng do server tính theo trọng số rubric; LLM chỉ chấm từng tiêu chí kèm trích dẫn nguyên văn, mỗi trích dẫn được kiểm tra có trong transcript (xem Rubric_Cham_Diem.md).</w:t>
+      </w:r>
+    </w:p>
+    <w:p>
+      <w:pPr>
+        <w:pStyle w:val="ListParagraph"/>
+        <w:numPr>
+          <w:ilvl w:val="0"/>
+          <w:numId w:val="2"/>
+        </w:numPr>
+        <w:spacing w:after="60"/>
+      </w:pPr>
+      <w:r>
+        <w:rPr>
+          <w:rFonts w:ascii="Calibri" w:cs="Calibri" w:eastAsia="Calibri" w:hAnsi="Calibri"/>
+          <w:b w:val="false"/>
+          <w:bCs w:val="false"/>
+          <w:sz w:val="22"/>
+          <w:szCs w:val="22"/>
+        </w:rPr>
+        <w:t>Quên mật khẩu: token dùng một lần, chỉ lưu bản băm, có hạn ngắn; email gửi qua MailService (SMTP). Token có hạn 30 phút.</w:t>
+      </w:r>
+    </w:p>
+    <w:p>
+      <w:pPr>
+        <w:pStyle w:val="ListParagraph"/>
+        <w:numPr>
+          <w:ilvl w:val="0"/>
+          <w:numId w:val="2"/>
+        </w:numPr>
+        <w:spacing w:after="60"/>
+      </w:pPr>
+      <w:r>
+        <w:rPr>
+          <w:rFonts w:ascii="Calibri" w:cs="Calibri" w:eastAsia="Calibri" w:hAnsi="Calibri"/>
+          <w:b w:val="false"/>
+          <w:bCs w:val="false"/>
+          <w:sz w:val="22"/>
+          <w:szCs w:val="22"/>
+        </w:rPr>
+        <w:t>Khóa tài khoản sau 5 lần đăng nhập sai tự mở khóa sau 15 phút (15 phút), lưu ở users.locked_until.</w:t>
+      </w:r>
+    </w:p>
+    <w:p>
+      <w:pPr>
+        <w:pStyle w:val="Heading2"/>
+        <w:keepNext/>
+        <w:spacing w:after="100" w:before="220"/>
       </w:pPr>
       <w:r>
         <w:rPr>
           <w:rFonts w:ascii="Calibri" w:cs="Calibri" w:eastAsia="Calibri" w:hAnsi="Calibri"/>
           <w:b/>
           <w:bCs/>
-          <w:color w:val="1F4E79"/>
-          <w:sz w:val="28"/>
-          <w:szCs w:val="28"/>
-        </w:rPr>
-        <w:t xml:space="preserve">3. Cấu trúc thư mục Spring Boot đề xuất</w:t>
+          <w:color w:val="2E5C8A"/>
+          <w:sz w:val="24"/>
+          <w:szCs w:val="24"/>
+        </w:rPr>
+        <w:t>2.3. Xử lý chấm điểm bất đồng bộ</w:t>
       </w:r>
     </w:p>
     <w:p>
@@ -1333,358 +1648,26 @@
           <w:sz w:val="22"/>
           <w:szCs w:val="22"/>
         </w:rPr>
-        <w:t xml:space="preserve">Áp dụng đúng 3-layer + adapter đã mô tả ở trên. Dùng làm khung khi setup project ở Sprint 2 (task Setup repository).</w:t>
-      </w:r>
-    </w:p>
-    <w:p>
-      <w:pPr>
-        <w:shd w:fill="F4F4F4" w:val="clear"/>
-        <w:spacing w:after="20"/>
-        <w:ind w:left="360"/>
-      </w:pPr>
-      <w:r>
-        <w:rPr>
-          <w:rFonts w:ascii="Consolas" w:cs="Consolas" w:eastAsia="Consolas" w:hAnsi="Consolas"/>
-          <w:sz w:val="18"/>
-          <w:szCs w:val="18"/>
-        </w:rPr>
-        <w:t xml:space="preserve">src/main/java/com/example/interviewpractice/</w:t>
-      </w:r>
-    </w:p>
-    <w:p>
-      <w:pPr>
-        <w:shd w:fill="F4F4F4" w:val="clear"/>
-        <w:spacing w:after="20"/>
-        <w:ind w:left="360"/>
-      </w:pPr>
-      <w:r>
-        <w:rPr>
-          <w:rFonts w:ascii="Consolas" w:cs="Consolas" w:eastAsia="Consolas" w:hAnsi="Consolas"/>
-          <w:sz w:val="18"/>
-          <w:szCs w:val="18"/>
-        </w:rPr>
-        <w:t xml:space="preserve">├── controller/</w:t>
-      </w:r>
-    </w:p>
-    <w:p>
-      <w:pPr>
-        <w:shd w:fill="F4F4F4" w:val="clear"/>
-        <w:spacing w:after="20"/>
-        <w:ind w:left="360"/>
-      </w:pPr>
-      <w:r>
-        <w:rPr>
-          <w:rFonts w:ascii="Consolas" w:cs="Consolas" w:eastAsia="Consolas" w:hAnsi="Consolas"/>
-          <w:sz w:val="18"/>
-          <w:szCs w:val="18"/>
-        </w:rPr>
-        <w:t xml:space="preserve">│   ├── AuthController.java</w:t>
-      </w:r>
-    </w:p>
-    <w:p>
-      <w:pPr>
-        <w:shd w:fill="F4F4F4" w:val="clear"/>
-        <w:spacing w:after="20"/>
-        <w:ind w:left="360"/>
-      </w:pPr>
-      <w:r>
-        <w:rPr>
-          <w:rFonts w:ascii="Consolas" w:cs="Consolas" w:eastAsia="Consolas" w:hAnsi="Consolas"/>
-          <w:sz w:val="18"/>
-          <w:szCs w:val="18"/>
-        </w:rPr>
-        <w:t xml:space="preserve">│   ├── PracticeController.java</w:t>
-      </w:r>
-    </w:p>
-    <w:p>
-      <w:pPr>
-        <w:shd w:fill="F4F4F4" w:val="clear"/>
-        <w:spacing w:after="20"/>
-        <w:ind w:left="360"/>
-      </w:pPr>
-      <w:r>
-        <w:rPr>
-          <w:rFonts w:ascii="Consolas" w:cs="Consolas" w:eastAsia="Consolas" w:hAnsi="Consolas"/>
-          <w:sz w:val="18"/>
-          <w:szCs w:val="18"/>
-        </w:rPr>
-        <w:t xml:space="preserve">│   └── AdminQuestionController.java</w:t>
-      </w:r>
-    </w:p>
-    <w:p>
-      <w:pPr>
-        <w:shd w:fill="F4F4F4" w:val="clear"/>
-        <w:spacing w:after="20"/>
-        <w:ind w:left="360"/>
-      </w:pPr>
-      <w:r>
-        <w:rPr>
-          <w:rFonts w:ascii="Consolas" w:cs="Consolas" w:eastAsia="Consolas" w:hAnsi="Consolas"/>
-          <w:sz w:val="18"/>
-          <w:szCs w:val="18"/>
-        </w:rPr>
-        <w:t xml:space="preserve">├── service/</w:t>
-      </w:r>
-    </w:p>
-    <w:p>
-      <w:pPr>
-        <w:shd w:fill="F4F4F4" w:val="clear"/>
-        <w:spacing w:after="20"/>
-        <w:ind w:left="360"/>
-      </w:pPr>
-      <w:r>
-        <w:rPr>
-          <w:rFonts w:ascii="Consolas" w:cs="Consolas" w:eastAsia="Consolas" w:hAnsi="Consolas"/>
-          <w:sz w:val="18"/>
-          <w:szCs w:val="18"/>
-        </w:rPr>
-        <w:t xml:space="preserve">│   ├── UserService.java</w:t>
-      </w:r>
-    </w:p>
-    <w:p>
-      <w:pPr>
-        <w:shd w:fill="F4F4F4" w:val="clear"/>
-        <w:spacing w:after="20"/>
-        <w:ind w:left="360"/>
-      </w:pPr>
-      <w:r>
-        <w:rPr>
-          <w:rFonts w:ascii="Consolas" w:cs="Consolas" w:eastAsia="Consolas" w:hAnsi="Consolas"/>
-          <w:sz w:val="18"/>
-          <w:szCs w:val="18"/>
-        </w:rPr>
-        <w:t xml:space="preserve">│   ├── ScoringService.java</w:t>
-      </w:r>
-    </w:p>
-    <w:p>
-      <w:pPr>
-        <w:shd w:fill="F4F4F4" w:val="clear"/>
-        <w:spacing w:after="20"/>
-        <w:ind w:left="360"/>
-      </w:pPr>
-      <w:r>
-        <w:rPr>
-          <w:rFonts w:ascii="Consolas" w:cs="Consolas" w:eastAsia="Consolas" w:hAnsi="Consolas"/>
-          <w:sz w:val="18"/>
-          <w:szCs w:val="18"/>
-        </w:rPr>
-        <w:t xml:space="preserve">│   ├── QuestionManagementService.java</w:t>
-      </w:r>
-    </w:p>
-    <w:p>
-      <w:pPr>
-        <w:shd w:fill="F4F4F4" w:val="clear"/>
-        <w:spacing w:after="20"/>
-        <w:ind w:left="360"/>
-      </w:pPr>
-      <w:r>
-        <w:rPr>
-          <w:rFonts w:ascii="Consolas" w:cs="Consolas" w:eastAsia="Consolas" w:hAnsi="Consolas"/>
-          <w:sz w:val="18"/>
-          <w:szCs w:val="18"/>
-        </w:rPr>
-        <w:t xml:space="preserve">│   └── ai/                      &lt;- các adapter gọi dịch vụ AI ngoài</w:t>
-      </w:r>
-    </w:p>
-    <w:p>
-      <w:pPr>
-        <w:shd w:fill="F4F4F4" w:val="clear"/>
-        <w:spacing w:after="20"/>
-        <w:ind w:left="360"/>
-      </w:pPr>
-      <w:r>
-        <w:rPr>
-          <w:rFonts w:ascii="Consolas" w:cs="Consolas" w:eastAsia="Consolas" w:hAnsi="Consolas"/>
-          <w:sz w:val="18"/>
-          <w:szCs w:val="18"/>
-        </w:rPr>
-        <w:t xml:space="preserve">│       ├── SttService.java</w:t>
-      </w:r>
-    </w:p>
-    <w:p>
-      <w:pPr>
-        <w:shd w:fill="F4F4F4" w:val="clear"/>
-        <w:spacing w:after="20"/>
-        <w:ind w:left="360"/>
-      </w:pPr>
-      <w:r>
-        <w:rPr>
-          <w:rFonts w:ascii="Consolas" w:cs="Consolas" w:eastAsia="Consolas" w:hAnsi="Consolas"/>
-          <w:sz w:val="18"/>
-          <w:szCs w:val="18"/>
-        </w:rPr>
-        <w:t xml:space="preserve">│       ├── LlmService.java</w:t>
-      </w:r>
-    </w:p>
-    <w:p>
-      <w:pPr>
-        <w:shd w:fill="F4F4F4" w:val="clear"/>
-        <w:spacing w:after="20"/>
-        <w:ind w:left="360"/>
-      </w:pPr>
-      <w:r>
-        <w:rPr>
-          <w:rFonts w:ascii="Consolas" w:cs="Consolas" w:eastAsia="Consolas" w:hAnsi="Consolas"/>
-          <w:sz w:val="18"/>
-          <w:szCs w:val="18"/>
-        </w:rPr>
-        <w:t xml:space="preserve">│       └── TtsService.java</w:t>
-      </w:r>
-    </w:p>
-    <w:p>
-      <w:pPr>
-        <w:shd w:fill="F4F4F4" w:val="clear"/>
-        <w:spacing w:after="20"/>
-        <w:ind w:left="360"/>
-      </w:pPr>
-      <w:r>
-        <w:rPr>
-          <w:rFonts w:ascii="Consolas" w:cs="Consolas" w:eastAsia="Consolas" w:hAnsi="Consolas"/>
-          <w:sz w:val="18"/>
-          <w:szCs w:val="18"/>
-        </w:rPr>
-        <w:t xml:space="preserve">├── repository/</w:t>
-      </w:r>
-    </w:p>
-    <w:p>
-      <w:pPr>
-        <w:shd w:fill="F4F4F4" w:val="clear"/>
-        <w:spacing w:after="20"/>
-        <w:ind w:left="360"/>
-      </w:pPr>
-      <w:r>
-        <w:rPr>
-          <w:rFonts w:ascii="Consolas" w:cs="Consolas" w:eastAsia="Consolas" w:hAnsi="Consolas"/>
-          <w:sz w:val="18"/>
-          <w:szCs w:val="18"/>
-        </w:rPr>
-        <w:t xml:space="preserve">│   ├── UserRepository.java</w:t>
-      </w:r>
-    </w:p>
-    <w:p>
-      <w:pPr>
-        <w:shd w:fill="F4F4F4" w:val="clear"/>
-        <w:spacing w:after="20"/>
-        <w:ind w:left="360"/>
-      </w:pPr>
-      <w:r>
-        <w:rPr>
-          <w:rFonts w:ascii="Consolas" w:cs="Consolas" w:eastAsia="Consolas" w:hAnsi="Consolas"/>
-          <w:sz w:val="18"/>
-          <w:szCs w:val="18"/>
-        </w:rPr>
-        <w:t xml:space="preserve">│   ├── PracticeRepository.java</w:t>
-      </w:r>
-    </w:p>
-    <w:p>
-      <w:pPr>
-        <w:shd w:fill="F4F4F4" w:val="clear"/>
-        <w:spacing w:after="20"/>
-        <w:ind w:left="360"/>
-      </w:pPr>
-      <w:r>
-        <w:rPr>
-          <w:rFonts w:ascii="Consolas" w:cs="Consolas" w:eastAsia="Consolas" w:hAnsi="Consolas"/>
-          <w:sz w:val="18"/>
-          <w:szCs w:val="18"/>
-        </w:rPr>
-        <w:t xml:space="preserve">│   ├── QuestionRepository.java</w:t>
-      </w:r>
-    </w:p>
-    <w:p>
-      <w:pPr>
-        <w:shd w:fill="F4F4F4" w:val="clear"/>
-        <w:spacing w:after="20"/>
-        <w:ind w:left="360"/>
-      </w:pPr>
-      <w:r>
-        <w:rPr>
-          <w:rFonts w:ascii="Consolas" w:cs="Consolas" w:eastAsia="Consolas" w:hAnsi="Consolas"/>
-          <w:sz w:val="18"/>
-          <w:szCs w:val="18"/>
-        </w:rPr>
-        <w:t xml:space="preserve">│   └── AuditLogRepository.java</w:t>
-      </w:r>
-    </w:p>
-    <w:p>
-      <w:pPr>
-        <w:shd w:fill="F4F4F4" w:val="clear"/>
-        <w:spacing w:after="20"/>
-        <w:ind w:left="360"/>
-      </w:pPr>
-      <w:r>
-        <w:rPr>
-          <w:rFonts w:ascii="Consolas" w:cs="Consolas" w:eastAsia="Consolas" w:hAnsi="Consolas"/>
-          <w:sz w:val="18"/>
-          <w:szCs w:val="18"/>
-        </w:rPr>
-        <w:t xml:space="preserve">├── entity/                      &lt;- các @Entity ánh xạ bảng DB</w:t>
-      </w:r>
-    </w:p>
-    <w:p>
-      <w:pPr>
-        <w:shd w:fill="F4F4F4" w:val="clear"/>
-        <w:spacing w:after="20"/>
-        <w:ind w:left="360"/>
-      </w:pPr>
-      <w:r>
-        <w:rPr>
-          <w:rFonts w:ascii="Consolas" w:cs="Consolas" w:eastAsia="Consolas" w:hAnsi="Consolas"/>
-          <w:sz w:val="18"/>
-          <w:szCs w:val="18"/>
-        </w:rPr>
-        <w:t xml:space="preserve">├── dto/                         &lt;- request/response object</w:t>
-      </w:r>
-    </w:p>
-    <w:p>
-      <w:pPr>
-        <w:shd w:fill="F4F4F4" w:val="clear"/>
-        <w:spacing w:after="20"/>
-        <w:ind w:left="360"/>
-      </w:pPr>
-      <w:r>
-        <w:rPr>
-          <w:rFonts w:ascii="Consolas" w:cs="Consolas" w:eastAsia="Consolas" w:hAnsi="Consolas"/>
-          <w:sz w:val="18"/>
-          <w:szCs w:val="18"/>
-        </w:rPr>
-        <w:t xml:space="preserve">├── security/                    &lt;- cấu hình JWT, filter xác thực</w:t>
-      </w:r>
-    </w:p>
-    <w:p>
-      <w:pPr>
-        <w:shd w:fill="F4F4F4" w:val="clear"/>
-        <w:spacing w:after="20"/>
-        <w:ind w:left="360"/>
-      </w:pPr>
-      <w:r>
-        <w:rPr>
-          <w:rFonts w:ascii="Consolas" w:cs="Consolas" w:eastAsia="Consolas" w:hAnsi="Consolas"/>
-          <w:sz w:val="18"/>
-          <w:szCs w:val="18"/>
-        </w:rPr>
-        <w:t xml:space="preserve">├── exception/                   &lt;- xử lý lỗi tập trung</w:t>
-      </w:r>
-    </w:p>
-    <w:p>
-      <w:pPr>
-        <w:shd w:fill="F4F4F4" w:val="clear"/>
-        <w:spacing w:after="20"/>
-        <w:ind w:left="360"/>
-      </w:pPr>
-      <w:r>
-        <w:rPr>
-          <w:rFonts w:ascii="Consolas" w:cs="Consolas" w:eastAsia="Consolas" w:hAnsi="Consolas"/>
-          <w:sz w:val="18"/>
-          <w:szCs w:val="18"/>
-        </w:rPr>
-        <w:t xml:space="preserve">└── config/                      &lt;- cấu hình bean (S3 client, Gemini client...)</w:t>
-      </w:r>
-    </w:p>
-    <w:p>
-      <w:pPr>
-        <w:spacing w:after="130"/>
-      </w:pPr>
+        <w:t>POST /practice-sessions/{id}/evaluate chuyển session sang PROCESSING, giao việc cho EvaluationExecutor và trả 202. Worker thực hiện STT (timeout 15 giây, retry 1 lần), tính Delivery (WPM, từ đệm), gọi LLM đúng 1 lần (retry 1 lần khi lỗi hoặc kết quả không hợp lệ), kiểm tra trích dẫn, tính điểm tổng rồi lưu ScoreResult và CriterionScore, đặt SCORED; nếu thất bại đặt FAILED kèm error_code. Client polling GET /practice-sessions/{id} mỗi 2 giây rồi gọi GET /practice-sessions/{id}/result. Người dùng có thể sửa transcript và gọi POST /practice-sessions/{id}/rescore (không gọi lại STT). Xem Hình 4.</w:t>
+      </w:r>
+    </w:p>
+    <w:p>
+      <w:pPr>
+        <w:pStyle w:val="Heading2"/>
+        <w:keepNext/>
+        <w:spacing w:after="100" w:before="220"/>
+      </w:pPr>
+      <w:r>
+        <w:rPr>
+          <w:rFonts w:ascii="Calibri" w:cs="Calibri" w:eastAsia="Calibri" w:hAnsi="Calibri"/>
+          <w:b/>
+          <w:bCs/>
+          <w:color w:val="2E5C8A"/>
+          <w:sz w:val="24"/>
+          <w:szCs w:val="24"/>
+        </w:rPr>
+        <w:t>2.4. Bảo mật</w:t>
+      </w:r>
     </w:p>
     <w:p>
       <w:pPr>
@@ -1700,12 +1683,1775 @@
           <w:sz w:val="22"/>
           <w:szCs w:val="22"/>
         </w:rPr>
-        <w:t xml:space="preserve">Lưu ý: package ai/ nằm trong service/ chứ không tách package riêng — vì các adapter vẫn thuộc tầng Service về mặt kiến trúc (đúng như đã thể hiện qua stereotype «control» trong Sequence Diagram), chỉ khác vai trò cụ thể.</w:t>
-      </w:r>
-    </w:p>
+        <w:t>JWT 24 giờ với role claim (CANDIDATE, ADMIN); JwtAuthFilter xác thực mọi request, đường dẫn /admin/** yêu cầu ADMIN, dữ liệu phiên và lịch sử chỉ trả cho đúng chủ sở hữu. Mật khẩu băm BCrypt; khóa tài khoản sau 5 lần sai; lỗi 401/403 trả ErrorResponse thống nhất. Bí mật (JWT_SECRET, khóa AI, AWS, SMTP) chỉ đọc từ biến môi trường. Xem Hình 5.</w:t>
+      </w:r>
+    </w:p>
+    <w:p>
+      <w:pPr>
+        <w:pStyle w:val="Heading2"/>
+        <w:keepNext/>
+        <w:spacing w:after="100" w:before="220"/>
+      </w:pPr>
+      <w:r>
+        <w:rPr>
+          <w:rFonts w:ascii="Calibri" w:cs="Calibri" w:eastAsia="Calibri" w:hAnsi="Calibri"/>
+          <w:b/>
+          <w:bCs/>
+          <w:color w:val="2E5C8A"/>
+          <w:sz w:val="24"/>
+          <w:szCs w:val="24"/>
+        </w:rPr>
+        <w:t>2.5. Triển khai và cấu hình môi trường</w:t>
+      </w:r>
+    </w:p>
+    <w:p>
+      <w:pPr>
+        <w:spacing w:after="100"/>
+      </w:pPr>
+      <w:r>
+        <w:rPr>
+          <w:rFonts w:ascii="Calibri" w:cs="Calibri" w:eastAsia="Calibri" w:hAnsi="Calibri"/>
+          <w:b w:val="false"/>
+          <w:bCs w:val="false"/>
+          <w:i w:val="false"/>
+          <w:iCs w:val="false"/>
+          <w:sz w:val="22"/>
+          <w:szCs w:val="22"/>
+        </w:rPr>
+        <w:t>Frontend là Render Static Site, backend là Render Web Service (Docker); PostgreSQL và S3 là dịch vụ ngoài kết nối qua biến môi trường. CI/CD: GitHub Actions build và test, Render tự triển khai khi nhánh chính cập nhật (xem Hình 3). PostgreSQL dùng gói managed của Render (kết nối qua DATABASE_URL).</w:t>
+      </w:r>
+    </w:p>
+    <w:tbl>
+      <w:tblPr>
+        <w:tblW w:type="dxa" w:w="9200"/>
+        <w:tblBorders>
+          <w:top w:val="single" w:color="auto" w:sz="4"/>
+          <w:left w:val="single" w:color="auto" w:sz="4"/>
+          <w:bottom w:val="single" w:color="auto" w:sz="4"/>
+          <w:right w:val="single" w:color="auto" w:sz="4"/>
+          <w:insideH w:val="single" w:color="auto" w:sz="4"/>
+          <w:insideV w:val="single" w:color="auto" w:sz="4"/>
+        </w:tblBorders>
+      </w:tblPr>
+      <w:tblGrid>
+        <w:gridCol w:w="2600"/>
+        <w:gridCol w:w="4200"/>
+        <w:gridCol w:w="2400"/>
+      </w:tblGrid>
+      <w:tr>
+        <w:trPr>
+          <w:tblHeader/>
+        </w:trPr>
+        <w:tc>
+          <w:tcPr>
+            <w:tcW w:type="dxa" w:w="2600"/>
+            <w:shd w:fill="D9E2F3" w:val="clear"/>
+            <w:tcMar>
+              <w:top w:type="dxa" w:w="70"/>
+              <w:left w:type="dxa" w:w="90"/>
+              <w:bottom w:type="dxa" w:w="70"/>
+              <w:right w:type="dxa" w:w="90"/>
+            </w:tcMar>
+          </w:tcPr>
+          <w:p>
+            <w:r>
+              <w:rPr>
+                <w:rFonts w:ascii="Calibri" w:cs="Calibri" w:eastAsia="Calibri" w:hAnsi="Calibri"/>
+                <w:b/>
+                <w:bCs/>
+                <w:sz w:val="20"/>
+                <w:szCs w:val="20"/>
+              </w:rPr>
+              <w:t>Biến môi trường</w:t>
+            </w:r>
+          </w:p>
+        </w:tc>
+        <w:tc>
+          <w:tcPr>
+            <w:tcW w:type="dxa" w:w="4200"/>
+            <w:shd w:fill="D9E2F3" w:val="clear"/>
+            <w:tcMar>
+              <w:top w:type="dxa" w:w="70"/>
+              <w:left w:type="dxa" w:w="90"/>
+              <w:bottom w:type="dxa" w:w="70"/>
+              <w:right w:type="dxa" w:w="90"/>
+            </w:tcMar>
+          </w:tcPr>
+          <w:p>
+            <w:r>
+              <w:rPr>
+                <w:rFonts w:ascii="Calibri" w:cs="Calibri" w:eastAsia="Calibri" w:hAnsi="Calibri"/>
+                <w:b/>
+                <w:bCs/>
+                <w:sz w:val="20"/>
+                <w:szCs w:val="20"/>
+              </w:rPr>
+              <w:t>Mục đích</w:t>
+            </w:r>
+          </w:p>
+        </w:tc>
+        <w:tc>
+          <w:tcPr>
+            <w:tcW w:type="dxa" w:w="2400"/>
+            <w:shd w:fill="D9E2F3" w:val="clear"/>
+            <w:tcMar>
+              <w:top w:type="dxa" w:w="70"/>
+              <w:left w:type="dxa" w:w="90"/>
+              <w:bottom w:type="dxa" w:w="70"/>
+              <w:right w:type="dxa" w:w="90"/>
+            </w:tcMar>
+          </w:tcPr>
+          <w:p>
+            <w:r>
+              <w:rPr>
+                <w:rFonts w:ascii="Calibri" w:cs="Calibri" w:eastAsia="Calibri" w:hAnsi="Calibri"/>
+                <w:b/>
+                <w:bCs/>
+                <w:sz w:val="20"/>
+                <w:szCs w:val="20"/>
+              </w:rPr>
+              <w:t>Trạng thái</w:t>
+            </w:r>
+          </w:p>
+        </w:tc>
+      </w:tr>
+      <w:tr>
+        <w:tc>
+          <w:tcPr>
+            <w:tcW w:type="dxa" w:w="2600"/>
+            <w:tcMar>
+              <w:top w:type="dxa" w:w="70"/>
+              <w:left w:type="dxa" w:w="90"/>
+              <w:bottom w:type="dxa" w:w="70"/>
+              <w:right w:type="dxa" w:w="90"/>
+            </w:tcMar>
+          </w:tcPr>
+          <w:p>
+            <w:r>
+              <w:rPr>
+                <w:rFonts w:ascii="Calibri" w:cs="Calibri" w:eastAsia="Calibri" w:hAnsi="Calibri"/>
+                <w:b w:val="false"/>
+                <w:bCs w:val="false"/>
+                <w:sz w:val="20"/>
+                <w:szCs w:val="20"/>
+              </w:rPr>
+              <w:t>DATABASE_URL</w:t>
+            </w:r>
+          </w:p>
+        </w:tc>
+        <w:tc>
+          <w:tcPr>
+            <w:tcW w:type="dxa" w:w="4200"/>
+            <w:tcMar>
+              <w:top w:type="dxa" w:w="70"/>
+              <w:left w:type="dxa" w:w="90"/>
+              <w:bottom w:type="dxa" w:w="70"/>
+              <w:right w:type="dxa" w:w="90"/>
+            </w:tcMar>
+          </w:tcPr>
+          <w:p>
+            <w:r>
+              <w:rPr>
+                <w:rFonts w:ascii="Calibri" w:cs="Calibri" w:eastAsia="Calibri" w:hAnsi="Calibri"/>
+                <w:b w:val="false"/>
+                <w:bCs w:val="false"/>
+                <w:sz w:val="20"/>
+                <w:szCs w:val="20"/>
+              </w:rPr>
+              <w:t>Chuỗi kết nối PostgreSQL</w:t>
+            </w:r>
+          </w:p>
+        </w:tc>
+        <w:tc>
+          <w:tcPr>
+            <w:tcW w:type="dxa" w:w="2400"/>
+            <w:tcMar>
+              <w:top w:type="dxa" w:w="70"/>
+              <w:left w:type="dxa" w:w="90"/>
+              <w:bottom w:type="dxa" w:w="70"/>
+              <w:right w:type="dxa" w:w="90"/>
+            </w:tcMar>
+          </w:tcPr>
+          <w:p>
+            <w:r>
+              <w:rPr>
+                <w:rFonts w:ascii="Calibri" w:cs="Calibri" w:eastAsia="Calibri" w:hAnsi="Calibri"/>
+                <w:b w:val="false"/>
+                <w:bCs w:val="false"/>
+                <w:sz w:val="20"/>
+                <w:szCs w:val="20"/>
+              </w:rPr>
+              <w:t>Có (đã có trong .env.example)</w:t>
+            </w:r>
+          </w:p>
+        </w:tc>
+      </w:tr>
+      <w:tr>
+        <w:tc>
+          <w:tcPr>
+            <w:tcW w:type="dxa" w:w="2600"/>
+            <w:tcMar>
+              <w:top w:type="dxa" w:w="70"/>
+              <w:left w:type="dxa" w:w="90"/>
+              <w:bottom w:type="dxa" w:w="70"/>
+              <w:right w:type="dxa" w:w="90"/>
+            </w:tcMar>
+          </w:tcPr>
+          <w:p>
+            <w:r>
+              <w:rPr>
+                <w:rFonts w:ascii="Calibri" w:cs="Calibri" w:eastAsia="Calibri" w:hAnsi="Calibri"/>
+                <w:b w:val="false"/>
+                <w:bCs w:val="false"/>
+                <w:sz w:val="20"/>
+                <w:szCs w:val="20"/>
+              </w:rPr>
+              <w:t>JWT_SECRET</w:t>
+            </w:r>
+          </w:p>
+        </w:tc>
+        <w:tc>
+          <w:tcPr>
+            <w:tcW w:type="dxa" w:w="4200"/>
+            <w:tcMar>
+              <w:top w:type="dxa" w:w="70"/>
+              <w:left w:type="dxa" w:w="90"/>
+              <w:bottom w:type="dxa" w:w="70"/>
+              <w:right w:type="dxa" w:w="90"/>
+            </w:tcMar>
+          </w:tcPr>
+          <w:p>
+            <w:r>
+              <w:rPr>
+                <w:rFonts w:ascii="Calibri" w:cs="Calibri" w:eastAsia="Calibri" w:hAnsi="Calibri"/>
+                <w:b w:val="false"/>
+                <w:bCs w:val="false"/>
+                <w:sz w:val="20"/>
+                <w:szCs w:val="20"/>
+              </w:rPr>
+              <w:t>Khóa ký JWT</w:t>
+            </w:r>
+          </w:p>
+        </w:tc>
+        <w:tc>
+          <w:tcPr>
+            <w:tcW w:type="dxa" w:w="2400"/>
+            <w:tcMar>
+              <w:top w:type="dxa" w:w="70"/>
+              <w:left w:type="dxa" w:w="90"/>
+              <w:bottom w:type="dxa" w:w="70"/>
+              <w:right w:type="dxa" w:w="90"/>
+            </w:tcMar>
+          </w:tcPr>
+          <w:p>
+            <w:r>
+              <w:rPr>
+                <w:rFonts w:ascii="Calibri" w:cs="Calibri" w:eastAsia="Calibri" w:hAnsi="Calibri"/>
+                <w:b w:val="false"/>
+                <w:bCs w:val="false"/>
+                <w:sz w:val="20"/>
+                <w:szCs w:val="20"/>
+              </w:rPr>
+              <w:t>Có (đã có)</w:t>
+            </w:r>
+          </w:p>
+        </w:tc>
+      </w:tr>
+      <w:tr>
+        <w:tc>
+          <w:tcPr>
+            <w:tcW w:type="dxa" w:w="2600"/>
+            <w:tcMar>
+              <w:top w:type="dxa" w:w="70"/>
+              <w:left w:type="dxa" w:w="90"/>
+              <w:bottom w:type="dxa" w:w="70"/>
+              <w:right w:type="dxa" w:w="90"/>
+            </w:tcMar>
+          </w:tcPr>
+          <w:p>
+            <w:r>
+              <w:rPr>
+                <w:rFonts w:ascii="Calibri" w:cs="Calibri" w:eastAsia="Calibri" w:hAnsi="Calibri"/>
+                <w:b w:val="false"/>
+                <w:bCs w:val="false"/>
+                <w:sz w:val="20"/>
+                <w:szCs w:val="20"/>
+              </w:rPr>
+              <w:t>GEMINI_API_KEY</w:t>
+            </w:r>
+          </w:p>
+        </w:tc>
+        <w:tc>
+          <w:tcPr>
+            <w:tcW w:type="dxa" w:w="4200"/>
+            <w:tcMar>
+              <w:top w:type="dxa" w:w="70"/>
+              <w:left w:type="dxa" w:w="90"/>
+              <w:bottom w:type="dxa" w:w="70"/>
+              <w:right w:type="dxa" w:w="90"/>
+            </w:tcMar>
+          </w:tcPr>
+          <w:p>
+            <w:r>
+              <w:rPr>
+                <w:rFonts w:ascii="Calibri" w:cs="Calibri" w:eastAsia="Calibri" w:hAnsi="Calibri"/>
+                <w:b w:val="false"/>
+                <w:bCs w:val="false"/>
+                <w:sz w:val="20"/>
+                <w:szCs w:val="20"/>
+              </w:rPr>
+              <w:t>Gemini (STT + LLM)</w:t>
+            </w:r>
+          </w:p>
+        </w:tc>
+        <w:tc>
+          <w:tcPr>
+            <w:tcW w:type="dxa" w:w="2400"/>
+            <w:tcMar>
+              <w:top w:type="dxa" w:w="70"/>
+              <w:left w:type="dxa" w:w="90"/>
+              <w:bottom w:type="dxa" w:w="70"/>
+              <w:right w:type="dxa" w:w="90"/>
+            </w:tcMar>
+          </w:tcPr>
+          <w:p>
+            <w:r>
+              <w:rPr>
+                <w:rFonts w:ascii="Calibri" w:cs="Calibri" w:eastAsia="Calibri" w:hAnsi="Calibri"/>
+                <w:b w:val="false"/>
+                <w:bCs w:val="false"/>
+                <w:sz w:val="20"/>
+                <w:szCs w:val="20"/>
+              </w:rPr>
+              <w:t>Có (đã có)</w:t>
+            </w:r>
+          </w:p>
+        </w:tc>
+      </w:tr>
+      <w:tr>
+        <w:tc>
+          <w:tcPr>
+            <w:tcW w:type="dxa" w:w="2600"/>
+            <w:tcMar>
+              <w:top w:type="dxa" w:w="70"/>
+              <w:left w:type="dxa" w:w="90"/>
+              <w:bottom w:type="dxa" w:w="70"/>
+              <w:right w:type="dxa" w:w="90"/>
+            </w:tcMar>
+          </w:tcPr>
+          <w:p>
+            <w:r>
+              <w:rPr>
+                <w:rFonts w:ascii="Calibri" w:cs="Calibri" w:eastAsia="Calibri" w:hAnsi="Calibri"/>
+                <w:b w:val="false"/>
+                <w:bCs w:val="false"/>
+                <w:sz w:val="20"/>
+                <w:szCs w:val="20"/>
+              </w:rPr>
+              <w:t>FPT_AI_API_KEY</w:t>
+            </w:r>
+          </w:p>
+        </w:tc>
+        <w:tc>
+          <w:tcPr>
+            <w:tcW w:type="dxa" w:w="4200"/>
+            <w:tcMar>
+              <w:top w:type="dxa" w:w="70"/>
+              <w:left w:type="dxa" w:w="90"/>
+              <w:bottom w:type="dxa" w:w="70"/>
+              <w:right w:type="dxa" w:w="90"/>
+            </w:tcMar>
+          </w:tcPr>
+          <w:p>
+            <w:r>
+              <w:rPr>
+                <w:rFonts w:ascii="Calibri" w:cs="Calibri" w:eastAsia="Calibri" w:hAnsi="Calibri"/>
+                <w:b w:val="false"/>
+                <w:bCs w:val="false"/>
+                <w:sz w:val="20"/>
+                <w:szCs w:val="20"/>
+              </w:rPr>
+              <w:t>FPT.AI TTS</w:t>
+            </w:r>
+          </w:p>
+        </w:tc>
+        <w:tc>
+          <w:tcPr>
+            <w:tcW w:type="dxa" w:w="2400"/>
+            <w:tcMar>
+              <w:top w:type="dxa" w:w="70"/>
+              <w:left w:type="dxa" w:w="90"/>
+              <w:bottom w:type="dxa" w:w="70"/>
+              <w:right w:type="dxa" w:w="90"/>
+            </w:tcMar>
+          </w:tcPr>
+          <w:p>
+            <w:r>
+              <w:rPr>
+                <w:rFonts w:ascii="Calibri" w:cs="Calibri" w:eastAsia="Calibri" w:hAnsi="Calibri"/>
+                <w:b w:val="false"/>
+                <w:bCs w:val="false"/>
+                <w:sz w:val="20"/>
+                <w:szCs w:val="20"/>
+              </w:rPr>
+              <w:t>Có (đã có)</w:t>
+            </w:r>
+          </w:p>
+        </w:tc>
+      </w:tr>
+      <w:tr>
+        <w:tc>
+          <w:tcPr>
+            <w:tcW w:type="dxa" w:w="2600"/>
+            <w:tcMar>
+              <w:top w:type="dxa" w:w="70"/>
+              <w:left w:type="dxa" w:w="90"/>
+              <w:bottom w:type="dxa" w:w="70"/>
+              <w:right w:type="dxa" w:w="90"/>
+            </w:tcMar>
+          </w:tcPr>
+          <w:p>
+            <w:r>
+              <w:rPr>
+                <w:rFonts w:ascii="Calibri" w:cs="Calibri" w:eastAsia="Calibri" w:hAnsi="Calibri"/>
+                <w:b w:val="false"/>
+                <w:bCs w:val="false"/>
+                <w:sz w:val="20"/>
+                <w:szCs w:val="20"/>
+              </w:rPr>
+              <w:t>AWS_ACCESS_KEY_ID, AWS_SECRET_ACCESS_KEY</w:t>
+            </w:r>
+          </w:p>
+        </w:tc>
+        <w:tc>
+          <w:tcPr>
+            <w:tcW w:type="dxa" w:w="4200"/>
+            <w:tcMar>
+              <w:top w:type="dxa" w:w="70"/>
+              <w:left w:type="dxa" w:w="90"/>
+              <w:bottom w:type="dxa" w:w="70"/>
+              <w:right w:type="dxa" w:w="90"/>
+            </w:tcMar>
+          </w:tcPr>
+          <w:p>
+            <w:r>
+              <w:rPr>
+                <w:rFonts w:ascii="Calibri" w:cs="Calibri" w:eastAsia="Calibri" w:hAnsi="Calibri"/>
+                <w:b w:val="false"/>
+                <w:bCs w:val="false"/>
+                <w:sz w:val="20"/>
+                <w:szCs w:val="20"/>
+              </w:rPr>
+              <w:t>Truy cập S3</w:t>
+            </w:r>
+          </w:p>
+        </w:tc>
+        <w:tc>
+          <w:tcPr>
+            <w:tcW w:type="dxa" w:w="2400"/>
+            <w:tcMar>
+              <w:top w:type="dxa" w:w="70"/>
+              <w:left w:type="dxa" w:w="90"/>
+              <w:bottom w:type="dxa" w:w="70"/>
+              <w:right w:type="dxa" w:w="90"/>
+            </w:tcMar>
+          </w:tcPr>
+          <w:p>
+            <w:r>
+              <w:rPr>
+                <w:rFonts w:ascii="Calibri" w:cs="Calibri" w:eastAsia="Calibri" w:hAnsi="Calibri"/>
+                <w:b w:val="false"/>
+                <w:bCs w:val="false"/>
+                <w:sz w:val="20"/>
+                <w:szCs w:val="20"/>
+              </w:rPr>
+              <w:t>Có (đã có)</w:t>
+            </w:r>
+          </w:p>
+        </w:tc>
+      </w:tr>
+      <w:tr>
+        <w:tc>
+          <w:tcPr>
+            <w:tcW w:type="dxa" w:w="2600"/>
+            <w:tcMar>
+              <w:top w:type="dxa" w:w="70"/>
+              <w:left w:type="dxa" w:w="90"/>
+              <w:bottom w:type="dxa" w:w="70"/>
+              <w:right w:type="dxa" w:w="90"/>
+            </w:tcMar>
+          </w:tcPr>
+          <w:p>
+            <w:r>
+              <w:rPr>
+                <w:rFonts w:ascii="Calibri" w:cs="Calibri" w:eastAsia="Calibri" w:hAnsi="Calibri"/>
+                <w:b w:val="false"/>
+                <w:bCs w:val="false"/>
+                <w:sz w:val="20"/>
+                <w:szCs w:val="20"/>
+              </w:rPr>
+              <w:t>S3_BUCKET_NAME, AWS_REGION</w:t>
+            </w:r>
+          </w:p>
+        </w:tc>
+        <w:tc>
+          <w:tcPr>
+            <w:tcW w:type="dxa" w:w="4200"/>
+            <w:tcMar>
+              <w:top w:type="dxa" w:w="70"/>
+              <w:left w:type="dxa" w:w="90"/>
+              <w:bottom w:type="dxa" w:w="70"/>
+              <w:right w:type="dxa" w:w="90"/>
+            </w:tcMar>
+          </w:tcPr>
+          <w:p>
+            <w:r>
+              <w:rPr>
+                <w:rFonts w:ascii="Calibri" w:cs="Calibri" w:eastAsia="Calibri" w:hAnsi="Calibri"/>
+                <w:b w:val="false"/>
+                <w:bCs w:val="false"/>
+                <w:sz w:val="20"/>
+                <w:szCs w:val="20"/>
+              </w:rPr>
+              <w:t>Bucket và vùng lưu audio</w:t>
+            </w:r>
+          </w:p>
+        </w:tc>
+        <w:tc>
+          <w:tcPr>
+            <w:tcW w:type="dxa" w:w="2400"/>
+            <w:tcMar>
+              <w:top w:type="dxa" w:w="70"/>
+              <w:left w:type="dxa" w:w="90"/>
+              <w:bottom w:type="dxa" w:w="70"/>
+              <w:right w:type="dxa" w:w="90"/>
+            </w:tcMar>
+          </w:tcPr>
+          <w:p>
+            <w:r>
+              <w:rPr>
+                <w:rFonts w:ascii="Calibri" w:cs="Calibri" w:eastAsia="Calibri" w:hAnsi="Calibri"/>
+                <w:b w:val="false"/>
+                <w:bCs w:val="false"/>
+                <w:sz w:val="20"/>
+                <w:szCs w:val="20"/>
+              </w:rPr>
+              <w:t>Có (đề xuất thêm)</w:t>
+            </w:r>
+          </w:p>
+        </w:tc>
+      </w:tr>
+      <w:tr>
+        <w:tc>
+          <w:tcPr>
+            <w:tcW w:type="dxa" w:w="2600"/>
+            <w:tcMar>
+              <w:top w:type="dxa" w:w="70"/>
+              <w:left w:type="dxa" w:w="90"/>
+              <w:bottom w:type="dxa" w:w="70"/>
+              <w:right w:type="dxa" w:w="90"/>
+            </w:tcMar>
+          </w:tcPr>
+          <w:p>
+            <w:r>
+              <w:rPr>
+                <w:rFonts w:ascii="Calibri" w:cs="Calibri" w:eastAsia="Calibri" w:hAnsi="Calibri"/>
+                <w:b w:val="false"/>
+                <w:bCs w:val="false"/>
+                <w:sz w:val="20"/>
+                <w:szCs w:val="20"/>
+              </w:rPr>
+              <w:t>SMTP_HOST, SMTP_PORT, SMTP_USERNAME, SMTP_PASSWORD, MAIL_FROM</w:t>
+            </w:r>
+          </w:p>
+        </w:tc>
+        <w:tc>
+          <w:tcPr>
+            <w:tcW w:type="dxa" w:w="4200"/>
+            <w:tcMar>
+              <w:top w:type="dxa" w:w="70"/>
+              <w:left w:type="dxa" w:w="90"/>
+              <w:bottom w:type="dxa" w:w="70"/>
+              <w:right w:type="dxa" w:w="90"/>
+            </w:tcMar>
+          </w:tcPr>
+          <w:p>
+            <w:r>
+              <w:rPr>
+                <w:rFonts w:ascii="Calibri" w:cs="Calibri" w:eastAsia="Calibri" w:hAnsi="Calibri"/>
+                <w:b w:val="false"/>
+                <w:bCs w:val="false"/>
+                <w:sz w:val="20"/>
+                <w:szCs w:val="20"/>
+              </w:rPr>
+              <w:t>Gửi email đặt lại mật khẩu</w:t>
+            </w:r>
+          </w:p>
+        </w:tc>
+        <w:tc>
+          <w:tcPr>
+            <w:tcW w:type="dxa" w:w="2400"/>
+            <w:tcMar>
+              <w:top w:type="dxa" w:w="70"/>
+              <w:left w:type="dxa" w:w="90"/>
+              <w:bottom w:type="dxa" w:w="70"/>
+              <w:right w:type="dxa" w:w="90"/>
+            </w:tcMar>
+          </w:tcPr>
+          <w:p>
+            <w:r>
+              <w:rPr>
+                <w:rFonts w:ascii="Calibri" w:cs="Calibri" w:eastAsia="Calibri" w:hAnsi="Calibri"/>
+                <w:b w:val="false"/>
+                <w:bCs w:val="false"/>
+                <w:sz w:val="20"/>
+                <w:szCs w:val="20"/>
+              </w:rPr>
+              <w:t>Có (đề xuất thêm)</w:t>
+            </w:r>
+          </w:p>
+        </w:tc>
+      </w:tr>
+      <w:tr>
+        <w:tc>
+          <w:tcPr>
+            <w:tcW w:type="dxa" w:w="2600"/>
+            <w:tcMar>
+              <w:top w:type="dxa" w:w="70"/>
+              <w:left w:type="dxa" w:w="90"/>
+              <w:bottom w:type="dxa" w:w="70"/>
+              <w:right w:type="dxa" w:w="90"/>
+            </w:tcMar>
+          </w:tcPr>
+          <w:p>
+            <w:r>
+              <w:rPr>
+                <w:rFonts w:ascii="Calibri" w:cs="Calibri" w:eastAsia="Calibri" w:hAnsi="Calibri"/>
+                <w:b w:val="false"/>
+                <w:bCs w:val="false"/>
+                <w:sz w:val="20"/>
+                <w:szCs w:val="20"/>
+              </w:rPr>
+              <w:t>APP_FRONTEND_URL</w:t>
+            </w:r>
+          </w:p>
+        </w:tc>
+        <w:tc>
+          <w:tcPr>
+            <w:tcW w:type="dxa" w:w="4200"/>
+            <w:tcMar>
+              <w:top w:type="dxa" w:w="70"/>
+              <w:left w:type="dxa" w:w="90"/>
+              <w:bottom w:type="dxa" w:w="70"/>
+              <w:right w:type="dxa" w:w="90"/>
+            </w:tcMar>
+          </w:tcPr>
+          <w:p>
+            <w:r>
+              <w:rPr>
+                <w:rFonts w:ascii="Calibri" w:cs="Calibri" w:eastAsia="Calibri" w:hAnsi="Calibri"/>
+                <w:b w:val="false"/>
+                <w:bCs w:val="false"/>
+                <w:sz w:val="20"/>
+                <w:szCs w:val="20"/>
+              </w:rPr>
+              <w:t>Gốc URL để tạo link đặt lại mật khẩu</w:t>
+            </w:r>
+          </w:p>
+        </w:tc>
+        <w:tc>
+          <w:tcPr>
+            <w:tcW w:type="dxa" w:w="2400"/>
+            <w:tcMar>
+              <w:top w:type="dxa" w:w="70"/>
+              <w:left w:type="dxa" w:w="90"/>
+              <w:bottom w:type="dxa" w:w="70"/>
+              <w:right w:type="dxa" w:w="90"/>
+            </w:tcMar>
+          </w:tcPr>
+          <w:p>
+            <w:r>
+              <w:rPr>
+                <w:rFonts w:ascii="Calibri" w:cs="Calibri" w:eastAsia="Calibri" w:hAnsi="Calibri"/>
+                <w:b w:val="false"/>
+                <w:bCs w:val="false"/>
+                <w:sz w:val="20"/>
+                <w:szCs w:val="20"/>
+              </w:rPr>
+              <w:t>Có (đề xuất thêm)</w:t>
+            </w:r>
+          </w:p>
+        </w:tc>
+      </w:tr>
+    </w:tbl>
+    <w:p>
+      <w:pPr>
+        <w:pStyle w:val="Heading2"/>
+        <w:keepNext/>
+        <w:spacing w:after="100" w:before="220"/>
+      </w:pPr>
+      <w:r>
+        <w:rPr>
+          <w:rFonts w:ascii="Calibri" w:cs="Calibri" w:eastAsia="Calibri" w:hAnsi="Calibri"/>
+          <w:b/>
+          <w:bCs/>
+          <w:color w:val="2E5C8A"/>
+          <w:sz w:val="24"/>
+          <w:szCs w:val="24"/>
+        </w:rPr>
+        <w:t>2.6. Yêu cầu phi chức năng</w:t>
+      </w:r>
+    </w:p>
+    <w:tbl>
+      <w:tblPr>
+        <w:tblW w:type="dxa" w:w="9200"/>
+        <w:tblBorders>
+          <w:top w:val="single" w:color="auto" w:sz="4"/>
+          <w:left w:val="single" w:color="auto" w:sz="4"/>
+          <w:bottom w:val="single" w:color="auto" w:sz="4"/>
+          <w:right w:val="single" w:color="auto" w:sz="4"/>
+          <w:insideH w:val="single" w:color="auto" w:sz="4"/>
+          <w:insideV w:val="single" w:color="auto" w:sz="4"/>
+        </w:tblBorders>
+      </w:tblPr>
+      <w:tblGrid>
+        <w:gridCol w:w="2600"/>
+        <w:gridCol w:w="4200"/>
+        <w:gridCol w:w="2400"/>
+      </w:tblGrid>
+      <w:tr>
+        <w:trPr>
+          <w:tblHeader/>
+        </w:trPr>
+        <w:tc>
+          <w:tcPr>
+            <w:tcW w:type="dxa" w:w="2600"/>
+            <w:shd w:fill="D9E2F3" w:val="clear"/>
+            <w:tcMar>
+              <w:top w:type="dxa" w:w="70"/>
+              <w:left w:type="dxa" w:w="90"/>
+              <w:bottom w:type="dxa" w:w="70"/>
+              <w:right w:type="dxa" w:w="90"/>
+            </w:tcMar>
+          </w:tcPr>
+          <w:p>
+            <w:r>
+              <w:rPr>
+                <w:rFonts w:ascii="Calibri" w:cs="Calibri" w:eastAsia="Calibri" w:hAnsi="Calibri"/>
+                <w:b/>
+                <w:bCs/>
+                <w:sz w:val="20"/>
+                <w:szCs w:val="20"/>
+              </w:rPr>
+              <w:t>Mã</w:t>
+            </w:r>
+          </w:p>
+        </w:tc>
+        <w:tc>
+          <w:tcPr>
+            <w:tcW w:type="dxa" w:w="4200"/>
+            <w:shd w:fill="D9E2F3" w:val="clear"/>
+            <w:tcMar>
+              <w:top w:type="dxa" w:w="70"/>
+              <w:left w:type="dxa" w:w="90"/>
+              <w:bottom w:type="dxa" w:w="70"/>
+              <w:right w:type="dxa" w:w="90"/>
+            </w:tcMar>
+          </w:tcPr>
+          <w:p>
+            <w:r>
+              <w:rPr>
+                <w:rFonts w:ascii="Calibri" w:cs="Calibri" w:eastAsia="Calibri" w:hAnsi="Calibri"/>
+                <w:b/>
+                <w:bCs/>
+                <w:sz w:val="20"/>
+                <w:szCs w:val="20"/>
+              </w:rPr>
+              <w:t>Yêu cầu</w:t>
+            </w:r>
+          </w:p>
+        </w:tc>
+        <w:tc>
+          <w:tcPr>
+            <w:tcW w:type="dxa" w:w="2400"/>
+            <w:shd w:fill="D9E2F3" w:val="clear"/>
+            <w:tcMar>
+              <w:top w:type="dxa" w:w="70"/>
+              <w:left w:type="dxa" w:w="90"/>
+              <w:bottom w:type="dxa" w:w="70"/>
+              <w:right w:type="dxa" w:w="90"/>
+            </w:tcMar>
+          </w:tcPr>
+          <w:p>
+            <w:r>
+              <w:rPr>
+                <w:rFonts w:ascii="Calibri" w:cs="Calibri" w:eastAsia="Calibri" w:hAnsi="Calibri"/>
+                <w:b/>
+                <w:bCs/>
+                <w:sz w:val="20"/>
+                <w:szCs w:val="20"/>
+              </w:rPr>
+              <w:t>Cách đảm bảo / đo</w:t>
+            </w:r>
+          </w:p>
+        </w:tc>
+      </w:tr>
+      <w:tr>
+        <w:tc>
+          <w:tcPr>
+            <w:tcW w:type="dxa" w:w="2600"/>
+            <w:tcMar>
+              <w:top w:type="dxa" w:w="70"/>
+              <w:left w:type="dxa" w:w="90"/>
+              <w:bottom w:type="dxa" w:w="70"/>
+              <w:right w:type="dxa" w:w="90"/>
+            </w:tcMar>
+          </w:tcPr>
+          <w:p>
+            <w:r>
+              <w:rPr>
+                <w:rFonts w:ascii="Calibri" w:cs="Calibri" w:eastAsia="Calibri" w:hAnsi="Calibri"/>
+                <w:b w:val="false"/>
+                <w:bCs w:val="false"/>
+                <w:sz w:val="20"/>
+                <w:szCs w:val="20"/>
+              </w:rPr>
+              <w:t>NF1</w:t>
+            </w:r>
+          </w:p>
+        </w:tc>
+        <w:tc>
+          <w:tcPr>
+            <w:tcW w:type="dxa" w:w="4200"/>
+            <w:tcMar>
+              <w:top w:type="dxa" w:w="70"/>
+              <w:left w:type="dxa" w:w="90"/>
+              <w:bottom w:type="dxa" w:w="70"/>
+              <w:right w:type="dxa" w:w="90"/>
+            </w:tcMar>
+          </w:tcPr>
+          <w:p>
+            <w:r>
+              <w:rPr>
+                <w:rFonts w:ascii="Calibri" w:cs="Calibri" w:eastAsia="Calibri" w:hAnsi="Calibri"/>
+                <w:b w:val="false"/>
+                <w:bCs w:val="false"/>
+                <w:sz w:val="20"/>
+                <w:szCs w:val="20"/>
+              </w:rPr>
+              <w:t>202 trong ≤ 1 giây; có kết quả ≤ 12 giây từ lúc nộp audio</w:t>
+            </w:r>
+          </w:p>
+        </w:tc>
+        <w:tc>
+          <w:tcPr>
+            <w:tcW w:type="dxa" w:w="2400"/>
+            <w:tcMar>
+              <w:top w:type="dxa" w:w="70"/>
+              <w:left w:type="dxa" w:w="90"/>
+              <w:bottom w:type="dxa" w:w="70"/>
+              <w:right w:type="dxa" w:w="90"/>
+            </w:tcMar>
+          </w:tcPr>
+          <w:p>
+            <w:r>
+              <w:rPr>
+                <w:rFonts w:ascii="Calibri" w:cs="Calibri" w:eastAsia="Calibri" w:hAnsi="Calibri"/>
+                <w:b w:val="false"/>
+                <w:bCs w:val="false"/>
+                <w:sz w:val="20"/>
+                <w:szCs w:val="20"/>
+              </w:rPr>
+              <w:t>Đo 14 mẫu audio 10-131 giây; ghi nhận ngoại lệ STT 83 giây</w:t>
+            </w:r>
+          </w:p>
+        </w:tc>
+      </w:tr>
+      <w:tr>
+        <w:tc>
+          <w:tcPr>
+            <w:tcW w:type="dxa" w:w="2600"/>
+            <w:tcMar>
+              <w:top w:type="dxa" w:w="70"/>
+              <w:left w:type="dxa" w:w="90"/>
+              <w:bottom w:type="dxa" w:w="70"/>
+              <w:right w:type="dxa" w:w="90"/>
+            </w:tcMar>
+          </w:tcPr>
+          <w:p>
+            <w:r>
+              <w:rPr>
+                <w:rFonts w:ascii="Calibri" w:cs="Calibri" w:eastAsia="Calibri" w:hAnsi="Calibri"/>
+                <w:b w:val="false"/>
+                <w:bCs w:val="false"/>
+                <w:sz w:val="20"/>
+                <w:szCs w:val="20"/>
+              </w:rPr>
+              <w:t>NF2</w:t>
+            </w:r>
+          </w:p>
+        </w:tc>
+        <w:tc>
+          <w:tcPr>
+            <w:tcW w:type="dxa" w:w="4200"/>
+            <w:tcMar>
+              <w:top w:type="dxa" w:w="70"/>
+              <w:left w:type="dxa" w:w="90"/>
+              <w:bottom w:type="dxa" w:w="70"/>
+              <w:right w:type="dxa" w:w="90"/>
+            </w:tcMar>
+          </w:tcPr>
+          <w:p>
+            <w:r>
+              <w:rPr>
+                <w:rFonts w:ascii="Calibri" w:cs="Calibri" w:eastAsia="Calibri" w:hAnsi="Calibri"/>
+                <w:b w:val="false"/>
+                <w:bCs w:val="false"/>
+                <w:sz w:val="20"/>
+                <w:szCs w:val="20"/>
+              </w:rPr>
+              <w:t>Độ chính xác STT tiếng Việt &gt; 85% (môi trường ít tạp âm)</w:t>
+            </w:r>
+          </w:p>
+        </w:tc>
+        <w:tc>
+          <w:tcPr>
+            <w:tcW w:type="dxa" w:w="2400"/>
+            <w:tcMar>
+              <w:top w:type="dxa" w:w="70"/>
+              <w:left w:type="dxa" w:w="90"/>
+              <w:bottom w:type="dxa" w:w="70"/>
+              <w:right w:type="dxa" w:w="90"/>
+            </w:tcMar>
+          </w:tcPr>
+          <w:p>
+            <w:r>
+              <w:rPr>
+                <w:rFonts w:ascii="Calibri" w:cs="Calibri" w:eastAsia="Calibri" w:hAnsi="Calibri"/>
+                <w:b w:val="false"/>
+                <w:bCs w:val="false"/>
+                <w:sz w:val="20"/>
+                <w:szCs w:val="20"/>
+              </w:rPr>
+              <w:t>Bộ dữ liệu chuẩn ở ticket DLPVXVTHA-129</w:t>
+            </w:r>
+          </w:p>
+        </w:tc>
+      </w:tr>
+      <w:tr>
+        <w:tc>
+          <w:tcPr>
+            <w:tcW w:type="dxa" w:w="2600"/>
+            <w:tcMar>
+              <w:top w:type="dxa" w:w="70"/>
+              <w:left w:type="dxa" w:w="90"/>
+              <w:bottom w:type="dxa" w:w="70"/>
+              <w:right w:type="dxa" w:w="90"/>
+            </w:tcMar>
+          </w:tcPr>
+          <w:p>
+            <w:r>
+              <w:rPr>
+                <w:rFonts w:ascii="Calibri" w:cs="Calibri" w:eastAsia="Calibri" w:hAnsi="Calibri"/>
+                <w:b w:val="false"/>
+                <w:bCs w:val="false"/>
+                <w:sz w:val="20"/>
+                <w:szCs w:val="20"/>
+              </w:rPr>
+              <w:t>NF3</w:t>
+            </w:r>
+          </w:p>
+        </w:tc>
+        <w:tc>
+          <w:tcPr>
+            <w:tcW w:type="dxa" w:w="4200"/>
+            <w:tcMar>
+              <w:top w:type="dxa" w:w="70"/>
+              <w:left w:type="dxa" w:w="90"/>
+              <w:bottom w:type="dxa" w:w="70"/>
+              <w:right w:type="dxa" w:w="90"/>
+            </w:tcMar>
+          </w:tcPr>
+          <w:p>
+            <w:r>
+              <w:rPr>
+                <w:rFonts w:ascii="Calibri" w:cs="Calibri" w:eastAsia="Calibri" w:hAnsi="Calibri"/>
+                <w:b w:val="false"/>
+                <w:bCs w:val="false"/>
+                <w:sz w:val="20"/>
+                <w:szCs w:val="20"/>
+              </w:rPr>
+              <w:t>Bảo mật: JWT 24 giờ, RBAC, BCrypt, khóa tài khoản</w:t>
+            </w:r>
+          </w:p>
+        </w:tc>
+        <w:tc>
+          <w:tcPr>
+            <w:tcW w:type="dxa" w:w="2400"/>
+            <w:tcMar>
+              <w:top w:type="dxa" w:w="70"/>
+              <w:left w:type="dxa" w:w="90"/>
+              <w:bottom w:type="dxa" w:w="70"/>
+              <w:right w:type="dxa" w:w="90"/>
+            </w:tcMar>
+          </w:tcPr>
+          <w:p>
+            <w:r>
+              <w:rPr>
+                <w:rFonts w:ascii="Calibri" w:cs="Calibri" w:eastAsia="Calibri" w:hAnsi="Calibri"/>
+                <w:b w:val="false"/>
+                <w:bCs w:val="false"/>
+                <w:sz w:val="20"/>
+                <w:szCs w:val="20"/>
+              </w:rPr>
+              <w:t>Kiểm thử phân quyền theo từng endpoint</w:t>
+            </w:r>
+          </w:p>
+        </w:tc>
+      </w:tr>
+      <w:tr>
+        <w:tc>
+          <w:tcPr>
+            <w:tcW w:type="dxa" w:w="2600"/>
+            <w:tcMar>
+              <w:top w:type="dxa" w:w="70"/>
+              <w:left w:type="dxa" w:w="90"/>
+              <w:bottom w:type="dxa" w:w="70"/>
+              <w:right w:type="dxa" w:w="90"/>
+            </w:tcMar>
+          </w:tcPr>
+          <w:p>
+            <w:r>
+              <w:rPr>
+                <w:rFonts w:ascii="Calibri" w:cs="Calibri" w:eastAsia="Calibri" w:hAnsi="Calibri"/>
+                <w:b w:val="false"/>
+                <w:bCs w:val="false"/>
+                <w:sz w:val="20"/>
+                <w:szCs w:val="20"/>
+              </w:rPr>
+              <w:t>NF4</w:t>
+            </w:r>
+          </w:p>
+        </w:tc>
+        <w:tc>
+          <w:tcPr>
+            <w:tcW w:type="dxa" w:w="4200"/>
+            <w:tcMar>
+              <w:top w:type="dxa" w:w="70"/>
+              <w:left w:type="dxa" w:w="90"/>
+              <w:bottom w:type="dxa" w:w="70"/>
+              <w:right w:type="dxa" w:w="90"/>
+            </w:tcMar>
+          </w:tcPr>
+          <w:p>
+            <w:r>
+              <w:rPr>
+                <w:rFonts w:ascii="Calibri" w:cs="Calibri" w:eastAsia="Calibri" w:hAnsi="Calibri"/>
+                <w:b w:val="false"/>
+                <w:bCs w:val="false"/>
+                <w:sz w:val="20"/>
+                <w:szCs w:val="20"/>
+              </w:rPr>
+              <w:t>Truy vết: lưu rubricVersion, promptVersion, modelVersion cho mỗi kết quả</w:t>
+            </w:r>
+          </w:p>
+        </w:tc>
+        <w:tc>
+          <w:tcPr>
+            <w:tcW w:type="dxa" w:w="2400"/>
+            <w:tcMar>
+              <w:top w:type="dxa" w:w="70"/>
+              <w:left w:type="dxa" w:w="90"/>
+              <w:bottom w:type="dxa" w:w="70"/>
+              <w:right w:type="dxa" w:w="90"/>
+            </w:tcMar>
+          </w:tcPr>
+          <w:p>
+            <w:r>
+              <w:rPr>
+                <w:rFonts w:ascii="Calibri" w:cs="Calibri" w:eastAsia="Calibri" w:hAnsi="Calibri"/>
+                <w:b w:val="false"/>
+                <w:bCs w:val="false"/>
+                <w:sz w:val="20"/>
+                <w:szCs w:val="20"/>
+              </w:rPr>
+              <w:t>Cột version trong score_results</w:t>
+            </w:r>
+          </w:p>
+        </w:tc>
+      </w:tr>
+      <w:tr>
+        <w:tc>
+          <w:tcPr>
+            <w:tcW w:type="dxa" w:w="2600"/>
+            <w:tcMar>
+              <w:top w:type="dxa" w:w="70"/>
+              <w:left w:type="dxa" w:w="90"/>
+              <w:bottom w:type="dxa" w:w="70"/>
+              <w:right w:type="dxa" w:w="90"/>
+            </w:tcMar>
+          </w:tcPr>
+          <w:p>
+            <w:r>
+              <w:rPr>
+                <w:rFonts w:ascii="Calibri" w:cs="Calibri" w:eastAsia="Calibri" w:hAnsi="Calibri"/>
+                <w:b w:val="false"/>
+                <w:bCs w:val="false"/>
+                <w:sz w:val="20"/>
+                <w:szCs w:val="20"/>
+              </w:rPr>
+              <w:t>NF5</w:t>
+            </w:r>
+          </w:p>
+        </w:tc>
+        <w:tc>
+          <w:tcPr>
+            <w:tcW w:type="dxa" w:w="4200"/>
+            <w:tcMar>
+              <w:top w:type="dxa" w:w="70"/>
+              <w:left w:type="dxa" w:w="90"/>
+              <w:bottom w:type="dxa" w:w="70"/>
+              <w:right w:type="dxa" w:w="90"/>
+            </w:tcMar>
+          </w:tcPr>
+          <w:p>
+            <w:r>
+              <w:rPr>
+                <w:rFonts w:ascii="Calibri" w:cs="Calibri" w:eastAsia="Calibri" w:hAnsi="Calibri"/>
+                <w:b w:val="false"/>
+                <w:bCs w:val="false"/>
+                <w:sz w:val="20"/>
+                <w:szCs w:val="20"/>
+              </w:rPr>
+              <w:t>Độ tin cậy chấm điểm: trích dẫn hợp lệ, điểm tổng tính ở server</w:t>
+            </w:r>
+          </w:p>
+        </w:tc>
+        <w:tc>
+          <w:tcPr>
+            <w:tcW w:type="dxa" w:w="2400"/>
+            <w:tcMar>
+              <w:top w:type="dxa" w:w="70"/>
+              <w:left w:type="dxa" w:w="90"/>
+              <w:bottom w:type="dxa" w:w="70"/>
+              <w:right w:type="dxa" w:w="90"/>
+            </w:tcMar>
+          </w:tcPr>
+          <w:p>
+            <w:r>
+              <w:rPr>
+                <w:rFonts w:ascii="Calibri" w:cs="Calibri" w:eastAsia="Calibri" w:hAnsi="Calibri"/>
+                <w:b w:val="false"/>
+                <w:bCs w:val="false"/>
+                <w:sz w:val="20"/>
+                <w:szCs w:val="20"/>
+              </w:rPr>
+              <w:t>QuoteValidator, ScoreCalculator, kiểm thử đơn vị với LLM mock</w:t>
+            </w:r>
+          </w:p>
+        </w:tc>
+      </w:tr>
+    </w:tbl>
     <w:p>
       <w:pPr>
         <w:pStyle w:val="Heading1"/>
+        <w:keepNext/>
+        <w:spacing w:after="150" w:before="340"/>
+      </w:pPr>
+      <w:r>
+        <w:rPr>
+          <w:rFonts w:ascii="Calibri" w:cs="Calibri" w:eastAsia="Calibri" w:hAnsi="Calibri"/>
+          <w:b/>
+          <w:bCs/>
+          <w:color w:val="1F4E79"/>
+          <w:sz w:val="28"/>
+          <w:szCs w:val="28"/>
+        </w:rPr>
+        <w:t xml:space="preserve">3. Cấu trúc thư mục Spring Boot đề xuất</w:t>
+      </w:r>
+    </w:p>
+    <w:p>
+      <w:pPr>
+        <w:spacing w:after="100"/>
+      </w:pPr>
+      <w:r>
+        <w:rPr>
+          <w:rFonts w:ascii="Calibri" w:cs="Calibri" w:eastAsia="Calibri" w:hAnsi="Calibri"/>
+          <w:b w:val="false"/>
+          <w:bCs w:val="false"/>
+          <w:i w:val="false"/>
+          <w:iCs w:val="false"/>
+          <w:sz w:val="22"/>
+          <w:szCs w:val="22"/>
+        </w:rPr>
+        <w:t xml:space="preserve">Áp dụng đúng 3-layer + adapter đã mô tả ở trên. Dùng làm khung khi setup project ở Sprint 2 (task Setup repository).</w:t>
+      </w:r>
+    </w:p>
+    <w:p>
+      <w:pPr>
+        <w:shd w:fill="F4F4F4" w:val="clear"/>
+        <w:spacing w:after="20"/>
+        <w:ind w:left="360"/>
+      </w:pPr>
+      <w:r>
+        <w:rPr>
+          <w:rFonts w:ascii="Consolas" w:cs="Consolas" w:eastAsia="Consolas" w:hAnsi="Consolas"/>
+          <w:sz w:val="18"/>
+          <w:szCs w:val="18"/>
+        </w:rPr>
+        <w:t xml:space="preserve">src/main/java/com/example/interviewpractice/</w:t>
+      </w:r>
+    </w:p>
+    <w:p>
+      <w:pPr>
+        <w:shd w:fill="F4F4F4" w:val="clear"/>
+        <w:spacing w:after="20"/>
+        <w:ind w:left="360"/>
+      </w:pPr>
+      <w:r>
+        <w:rPr>
+          <w:rFonts w:ascii="Consolas" w:cs="Consolas" w:eastAsia="Consolas" w:hAnsi="Consolas"/>
+          <w:sz w:val="18"/>
+          <w:szCs w:val="18"/>
+        </w:rPr>
+        <w:t>├── controller/</w:t>
+      </w:r>
+    </w:p>
+    <w:p>
+      <w:pPr>
+        <w:shd w:fill="F4F4F4" w:val="clear"/>
+        <w:spacing w:after="20"/>
+        <w:ind w:left="360"/>
+      </w:pPr>
+      <w:r>
+        <w:rPr>
+          <w:rFonts w:ascii="Consolas" w:cs="Consolas" w:eastAsia="Consolas" w:hAnsi="Consolas"/>
+          <w:sz w:val="18"/>
+          <w:szCs w:val="18"/>
+        </w:rPr>
+        <w:t>│   ├── AuthController.java</w:t>
+      </w:r>
+    </w:p>
+    <w:p>
+      <w:pPr>
+        <w:shd w:fill="F4F4F4" w:val="clear"/>
+        <w:spacing w:after="20"/>
+        <w:ind w:left="360"/>
+      </w:pPr>
+      <w:r>
+        <w:rPr>
+          <w:rFonts w:ascii="Consolas" w:cs="Consolas" w:eastAsia="Consolas" w:hAnsi="Consolas"/>
+          <w:sz w:val="18"/>
+          <w:szCs w:val="18"/>
+        </w:rPr>
+        <w:t>│   ├── QuestionController.java</w:t>
+      </w:r>
+    </w:p>
+    <w:p>
+      <w:pPr>
+        <w:shd w:fill="F4F4F4" w:val="clear"/>
+        <w:spacing w:after="20"/>
+        <w:ind w:left="360"/>
+      </w:pPr>
+      <w:r>
+        <w:rPr>
+          <w:rFonts w:ascii="Consolas" w:cs="Consolas" w:eastAsia="Consolas" w:hAnsi="Consolas"/>
+          <w:sz w:val="18"/>
+          <w:szCs w:val="18"/>
+        </w:rPr>
+        <w:t>│   ├── PracticeController.java</w:t>
+      </w:r>
+    </w:p>
+    <w:p>
+      <w:pPr>
+        <w:shd w:fill="F4F4F4" w:val="clear"/>
+        <w:spacing w:after="20"/>
+        <w:ind w:left="360"/>
+      </w:pPr>
+      <w:r>
+        <w:rPr>
+          <w:rFonts w:ascii="Consolas" w:cs="Consolas" w:eastAsia="Consolas" w:hAnsi="Consolas"/>
+          <w:sz w:val="18"/>
+          <w:szCs w:val="18"/>
+        </w:rPr>
+        <w:t>│   ├── FeedbackController.java</w:t>
+      </w:r>
+    </w:p>
+    <w:p>
+      <w:pPr>
+        <w:shd w:fill="F4F4F4" w:val="clear"/>
+        <w:spacing w:after="20"/>
+        <w:ind w:left="360"/>
+      </w:pPr>
+      <w:r>
+        <w:rPr>
+          <w:rFonts w:ascii="Consolas" w:cs="Consolas" w:eastAsia="Consolas" w:hAnsi="Consolas"/>
+          <w:sz w:val="18"/>
+          <w:szCs w:val="18"/>
+        </w:rPr>
+        <w:t>│   ├── HistoryController.java</w:t>
+      </w:r>
+    </w:p>
+    <w:p>
+      <w:pPr>
+        <w:shd w:fill="F4F4F4" w:val="clear"/>
+        <w:spacing w:after="20"/>
+        <w:ind w:left="360"/>
+      </w:pPr>
+      <w:r>
+        <w:rPr>
+          <w:rFonts w:ascii="Consolas" w:cs="Consolas" w:eastAsia="Consolas" w:hAnsi="Consolas"/>
+          <w:sz w:val="18"/>
+          <w:szCs w:val="18"/>
+        </w:rPr>
+        <w:t>│   ├── AdminQuestionController.java</w:t>
+      </w:r>
+    </w:p>
+    <w:p>
+      <w:pPr>
+        <w:shd w:fill="F4F4F4" w:val="clear"/>
+        <w:spacing w:after="20"/>
+        <w:ind w:left="360"/>
+      </w:pPr>
+      <w:r>
+        <w:rPr>
+          <w:rFonts w:ascii="Consolas" w:cs="Consolas" w:eastAsia="Consolas" w:hAnsi="Consolas"/>
+          <w:sz w:val="18"/>
+          <w:szCs w:val="18"/>
+        </w:rPr>
+        <w:t>│   └── AnalyticsController.java</w:t>
+      </w:r>
+    </w:p>
+    <w:p>
+      <w:pPr>
+        <w:shd w:fill="F4F4F4" w:val="clear"/>
+        <w:spacing w:after="20"/>
+        <w:ind w:left="360"/>
+      </w:pPr>
+      <w:r>
+        <w:rPr>
+          <w:rFonts w:ascii="Consolas" w:cs="Consolas" w:eastAsia="Consolas" w:hAnsi="Consolas"/>
+          <w:sz w:val="18"/>
+          <w:szCs w:val="18"/>
+        </w:rPr>
+        <w:t>├── service/</w:t>
+      </w:r>
+    </w:p>
+    <w:p>
+      <w:pPr>
+        <w:shd w:fill="F4F4F4" w:val="clear"/>
+        <w:spacing w:after="20"/>
+        <w:ind w:left="360"/>
+      </w:pPr>
+      <w:r>
+        <w:rPr>
+          <w:rFonts w:ascii="Consolas" w:cs="Consolas" w:eastAsia="Consolas" w:hAnsi="Consolas"/>
+          <w:sz w:val="18"/>
+          <w:szCs w:val="18"/>
+        </w:rPr>
+        <w:t>│   ├── UserService.java, AuthService.java, PasswordResetService.java</w:t>
+      </w:r>
+    </w:p>
+    <w:p>
+      <w:pPr>
+        <w:shd w:fill="F4F4F4" w:val="clear"/>
+        <w:spacing w:after="20"/>
+        <w:ind w:left="360"/>
+      </w:pPr>
+      <w:r>
+        <w:rPr>
+          <w:rFonts w:ascii="Consolas" w:cs="Consolas" w:eastAsia="Consolas" w:hAnsi="Consolas"/>
+          <w:sz w:val="18"/>
+          <w:szCs w:val="18"/>
+        </w:rPr>
+        <w:t>│   ├── LoginAttemptService.java</w:t>
+      </w:r>
+    </w:p>
+    <w:p>
+      <w:pPr>
+        <w:shd w:fill="F4F4F4" w:val="clear"/>
+        <w:spacing w:after="20"/>
+        <w:ind w:left="360"/>
+      </w:pPr>
+      <w:r>
+        <w:rPr>
+          <w:rFonts w:ascii="Consolas" w:cs="Consolas" w:eastAsia="Consolas" w:hAnsi="Consolas"/>
+          <w:sz w:val="18"/>
+          <w:szCs w:val="18"/>
+        </w:rPr>
+        <w:t>│   ├── QuestionService.java, QuestionManagementService.java</w:t>
+      </w:r>
+    </w:p>
+    <w:p>
+      <w:pPr>
+        <w:shd w:fill="F4F4F4" w:val="clear"/>
+        <w:spacing w:after="20"/>
+        <w:ind w:left="360"/>
+      </w:pPr>
+      <w:r>
+        <w:rPr>
+          <w:rFonts w:ascii="Consolas" w:cs="Consolas" w:eastAsia="Consolas" w:hAnsi="Consolas"/>
+          <w:sz w:val="18"/>
+          <w:szCs w:val="18"/>
+        </w:rPr>
+        <w:t>│   ├── PracticeService.java, AudioUploadService.java, FeedbackService.java</w:t>
+      </w:r>
+    </w:p>
+    <w:p>
+      <w:pPr>
+        <w:shd w:fill="F4F4F4" w:val="clear"/>
+        <w:spacing w:after="20"/>
+        <w:ind w:left="360"/>
+      </w:pPr>
+      <w:r>
+        <w:rPr>
+          <w:rFonts w:ascii="Consolas" w:cs="Consolas" w:eastAsia="Consolas" w:hAnsi="Consolas"/>
+          <w:sz w:val="18"/>
+          <w:szCs w:val="18"/>
+        </w:rPr>
+        <w:t>│   ├── PracticeHistoryService.java</w:t>
+      </w:r>
+    </w:p>
+    <w:p>
+      <w:pPr>
+        <w:shd w:fill="F4F4F4" w:val="clear"/>
+        <w:spacing w:after="20"/>
+        <w:ind w:left="360"/>
+      </w:pPr>
+      <w:r>
+        <w:rPr>
+          <w:rFonts w:ascii="Consolas" w:cs="Consolas" w:eastAsia="Consolas" w:hAnsi="Consolas"/>
+          <w:sz w:val="18"/>
+          <w:szCs w:val="18"/>
+        </w:rPr>
+        <w:t>│   ├── AuditLogService.java, AnalyticsService.java, ReportExportService.java</w:t>
+      </w:r>
+    </w:p>
+    <w:p>
+      <w:pPr>
+        <w:shd w:fill="F4F4F4" w:val="clear"/>
+        <w:spacing w:after="20"/>
+        <w:ind w:left="360"/>
+      </w:pPr>
+      <w:r>
+        <w:rPr>
+          <w:rFonts w:ascii="Consolas" w:cs="Consolas" w:eastAsia="Consolas" w:hAnsi="Consolas"/>
+          <w:sz w:val="18"/>
+          <w:szCs w:val="18"/>
+        </w:rPr>
+        <w:t>│   ├── scoring/               &lt;- chấm điểm AI</w:t>
+      </w:r>
+    </w:p>
+    <w:p>
+      <w:pPr>
+        <w:shd w:fill="F4F4F4" w:val="clear"/>
+        <w:spacing w:after="20"/>
+        <w:ind w:left="360"/>
+      </w:pPr>
+      <w:r>
+        <w:rPr>
+          <w:rFonts w:ascii="Consolas" w:cs="Consolas" w:eastAsia="Consolas" w:hAnsi="Consolas"/>
+          <w:sz w:val="18"/>
+          <w:szCs w:val="18"/>
+        </w:rPr>
+        <w:t>│   │   ├── ScoringService.java, EvaluationExecutor.java</w:t>
+      </w:r>
+    </w:p>
+    <w:p>
+      <w:pPr>
+        <w:shd w:fill="F4F4F4" w:val="clear"/>
+        <w:spacing w:after="20"/>
+        <w:ind w:left="360"/>
+      </w:pPr>
+      <w:r>
+        <w:rPr>
+          <w:rFonts w:ascii="Consolas" w:cs="Consolas" w:eastAsia="Consolas" w:hAnsi="Consolas"/>
+          <w:sz w:val="18"/>
+          <w:szCs w:val="18"/>
+        </w:rPr>
+        <w:t>│   │   ├── RubricProvider.java, PromptBuilder.java</w:t>
+      </w:r>
+    </w:p>
+    <w:p>
+      <w:pPr>
+        <w:shd w:fill="F4F4F4" w:val="clear"/>
+        <w:spacing w:after="20"/>
+        <w:ind w:left="360"/>
+      </w:pPr>
+      <w:r>
+        <w:rPr>
+          <w:rFonts w:ascii="Consolas" w:cs="Consolas" w:eastAsia="Consolas" w:hAnsi="Consolas"/>
+          <w:sz w:val="18"/>
+          <w:szCs w:val="18"/>
+        </w:rPr>
+        <w:t>│   │   └── QuoteValidator.java, ScoreCalculator.java, DeliveryAnalyzer.java</w:t>
+      </w:r>
+    </w:p>
+    <w:p>
+      <w:pPr>
+        <w:shd w:fill="F4F4F4" w:val="clear"/>
+        <w:spacing w:after="20"/>
+        <w:ind w:left="360"/>
+      </w:pPr>
+      <w:r>
+        <w:rPr>
+          <w:rFonts w:ascii="Consolas" w:cs="Consolas" w:eastAsia="Consolas" w:hAnsi="Consolas"/>
+          <w:sz w:val="18"/>
+          <w:szCs w:val="18"/>
+        </w:rPr>
+        <w:t>│   └── adapter/               &lt;- gọi dịch vụ ngoài qua interface provider</w:t>
+      </w:r>
+    </w:p>
+    <w:p>
+      <w:pPr>
+        <w:shd w:fill="F4F4F4" w:val="clear"/>
+        <w:spacing w:after="20"/>
+        <w:ind w:left="360"/>
+      </w:pPr>
+      <w:r>
+        <w:rPr>
+          <w:rFonts w:ascii="Consolas" w:cs="Consolas" w:eastAsia="Consolas" w:hAnsi="Consolas"/>
+          <w:sz w:val="18"/>
+          <w:szCs w:val="18"/>
+        </w:rPr>
+        <w:t>│       ├── SttService.java, LlmService.java, TtsService.java</w:t>
+      </w:r>
+    </w:p>
+    <w:p>
+      <w:pPr>
+        <w:shd w:fill="F4F4F4" w:val="clear"/>
+        <w:spacing w:after="20"/>
+        <w:ind w:left="360"/>
+      </w:pPr>
+      <w:r>
+        <w:rPr>
+          <w:rFonts w:ascii="Consolas" w:cs="Consolas" w:eastAsia="Consolas" w:hAnsi="Consolas"/>
+          <w:sz w:val="18"/>
+          <w:szCs w:val="18"/>
+        </w:rPr>
+        <w:t>│       ├── MailService.java, FileStorageService.java</w:t>
+      </w:r>
+    </w:p>
+    <w:p>
+      <w:pPr>
+        <w:shd w:fill="F4F4F4" w:val="clear"/>
+        <w:spacing w:after="20"/>
+        <w:ind w:left="360"/>
+      </w:pPr>
+      <w:r>
+        <w:rPr>
+          <w:rFonts w:ascii="Consolas" w:cs="Consolas" w:eastAsia="Consolas" w:hAnsi="Consolas"/>
+          <w:sz w:val="18"/>
+          <w:szCs w:val="18"/>
+        </w:rPr>
+        <w:t>│       └── provider/          &lt;- ISttProvider, ILlmProvider, ITtsProvider,</w:t>
+      </w:r>
+    </w:p>
+    <w:p>
+      <w:pPr>
+        <w:shd w:fill="F4F4F4" w:val="clear"/>
+        <w:spacing w:after="20"/>
+        <w:ind w:left="360"/>
+      </w:pPr>
+      <w:r>
+        <w:rPr>
+          <w:rFonts w:ascii="Consolas" w:cs="Consolas" w:eastAsia="Consolas" w:hAnsi="Consolas"/>
+          <w:sz w:val="18"/>
+          <w:szCs w:val="18"/>
+        </w:rPr>
+        <w:t>│                                 IMailProvider, IObjectStorageProvider</w:t>
+      </w:r>
+    </w:p>
+    <w:p>
+      <w:pPr>
+        <w:shd w:fill="F4F4F4" w:val="clear"/>
+        <w:spacing w:after="20"/>
+        <w:ind w:left="360"/>
+      </w:pPr>
+      <w:r>
+        <w:rPr>
+          <w:rFonts w:ascii="Consolas" w:cs="Consolas" w:eastAsia="Consolas" w:hAnsi="Consolas"/>
+          <w:sz w:val="18"/>
+          <w:szCs w:val="18"/>
+        </w:rPr>
+        <w:t>├── repository/                &lt;- 8 repository (User, Question, Practice, ScoreResult,</w:t>
+      </w:r>
+    </w:p>
+    <w:p>
+      <w:pPr>
+        <w:shd w:fill="F4F4F4" w:val="clear"/>
+        <w:spacing w:after="20"/>
+        <w:ind w:left="360"/>
+      </w:pPr>
+      <w:r>
+        <w:rPr>
+          <w:rFonts w:ascii="Consolas" w:cs="Consolas" w:eastAsia="Consolas" w:hAnsi="Consolas"/>
+          <w:sz w:val="18"/>
+          <w:szCs w:val="18"/>
+        </w:rPr>
+        <w:t>│                                 CriterionScore, AuditLog, ApiUsage, PasswordResetToken)</w:t>
+      </w:r>
+    </w:p>
+    <w:p>
+      <w:pPr>
+        <w:shd w:fill="F4F4F4" w:val="clear"/>
+        <w:spacing w:after="20"/>
+        <w:ind w:left="360"/>
+      </w:pPr>
+      <w:r>
+        <w:rPr>
+          <w:rFonts w:ascii="Consolas" w:cs="Consolas" w:eastAsia="Consolas" w:hAnsi="Consolas"/>
+          <w:sz w:val="18"/>
+          <w:szCs w:val="18"/>
+        </w:rPr>
+        <w:t>├── entity/                    &lt;- các @Entity ánh xạ bảng DB</w:t>
+      </w:r>
+    </w:p>
+    <w:p>
+      <w:pPr>
+        <w:shd w:fill="F4F4F4" w:val="clear"/>
+        <w:spacing w:after="20"/>
+        <w:ind w:left="360"/>
+      </w:pPr>
+      <w:r>
+        <w:rPr>
+          <w:rFonts w:ascii="Consolas" w:cs="Consolas" w:eastAsia="Consolas" w:hAnsi="Consolas"/>
+          <w:sz w:val="18"/>
+          <w:szCs w:val="18"/>
+        </w:rPr>
+        <w:t>├── dto/                       &lt;- request/response object</w:t>
+      </w:r>
+    </w:p>
+    <w:p>
+      <w:pPr>
+        <w:shd w:fill="F4F4F4" w:val="clear"/>
+        <w:spacing w:after="20"/>
+        <w:ind w:left="360"/>
+      </w:pPr>
+      <w:r>
+        <w:rPr>
+          <w:rFonts w:ascii="Consolas" w:cs="Consolas" w:eastAsia="Consolas" w:hAnsi="Consolas"/>
+          <w:sz w:val="18"/>
+          <w:szCs w:val="18"/>
+        </w:rPr>
+        <w:t>├── security/                  &lt;- JwtAuthFilter, JwtTokenProvider, AuthorizationService</w:t>
+      </w:r>
+    </w:p>
+    <w:p>
+      <w:pPr>
+        <w:shd w:fill="F4F4F4" w:val="clear"/>
+        <w:spacing w:after="20"/>
+        <w:ind w:left="360"/>
+      </w:pPr>
+      <w:r>
+        <w:rPr>
+          <w:rFonts w:ascii="Consolas" w:cs="Consolas" w:eastAsia="Consolas" w:hAnsi="Consolas"/>
+          <w:sz w:val="18"/>
+          <w:szCs w:val="18"/>
+        </w:rPr>
+        <w:t>├── exception/                 &lt;- GlobalExceptionHandler</w:t>
+      </w:r>
+    </w:p>
+    <w:p>
+      <w:pPr>
+        <w:shd w:fill="F4F4F4" w:val="clear"/>
+        <w:spacing w:after="20"/>
+        <w:ind w:left="360"/>
+      </w:pPr>
+      <w:r>
+        <w:rPr>
+          <w:rFonts w:ascii="Consolas" w:cs="Consolas" w:eastAsia="Consolas" w:hAnsi="Consolas"/>
+          <w:sz w:val="18"/>
+          <w:szCs w:val="18"/>
+        </w:rPr>
+        <w:t>└── config/                    &lt;- bean S3, Gemini, Mail; AsyncConfig (thread pool)</w:t>
+      </w:r>
+    </w:p>
+    <w:p>
+      <w:pPr>
+        <w:shd w:fill="F4F4F4" w:val="clear"/>
+        <w:spacing w:after="20"/>
+        <w:ind w:left="360"/>
+      </w:pPr>
+      <w:r>
+        <w:rPr>
+          <w:rFonts w:ascii="Consolas" w:cs="Consolas" w:eastAsia="Consolas" w:hAnsi="Consolas"/>
+          <w:sz w:val="18"/>
+          <w:szCs w:val="18"/>
+        </w:rPr>
+      </w:r>
+    </w:p>
+    <w:p>
+      <w:pPr>
+        <w:shd w:fill="F4F4F4" w:val="clear"/>
+        <w:spacing w:after="20"/>
+        <w:ind w:left="360"/>
+      </w:pPr>
+      <w:r>
+        <w:rPr>
+          <w:rFonts w:ascii="Consolas" w:cs="Consolas" w:eastAsia="Consolas" w:hAnsi="Consolas"/>
+          <w:sz w:val="18"/>
+          <w:szCs w:val="18"/>
+        </w:rPr>
+        <w:t>src/main/resources/</w:t>
+      </w:r>
+    </w:p>
+    <w:p>
+      <w:pPr>
+        <w:shd w:fill="F4F4F4" w:val="clear"/>
+        <w:spacing w:after="20"/>
+        <w:ind w:left="360"/>
+      </w:pPr>
+      <w:r>
+        <w:rPr>
+          <w:rFonts w:ascii="Consolas" w:cs="Consolas" w:eastAsia="Consolas" w:hAnsi="Consolas"/>
+          <w:sz w:val="18"/>
+          <w:szCs w:val="18"/>
+        </w:rPr>
+        <w:t>├── application.yml            &lt;- đọc biến môi trường</w:t>
+      </w:r>
+    </w:p>
+    <w:p>
+      <w:pPr>
+        <w:shd w:fill="F4F4F4" w:val="clear"/>
+        <w:spacing w:after="20"/>
+        <w:ind w:left="360"/>
+      </w:pPr>
+      <w:r>
+        <w:rPr>
+          <w:rFonts w:ascii="Consolas" w:cs="Consolas" w:eastAsia="Consolas" w:hAnsi="Consolas"/>
+          <w:sz w:val="18"/>
+          <w:szCs w:val="18"/>
+        </w:rPr>
+        <w:t>└── db/migration/V1__init.sql  &lt;- Flyway</w:t>
+      </w:r>
+    </w:p>
+    <w:p>
+      <w:pPr>
+        <w:spacing w:after="130"/>
+      </w:pPr>
+    </w:p>
+    <w:p>
+      <w:pPr>
+        <w:spacing w:after="100"/>
+      </w:pPr>
+      <w:r>
+        <w:rPr>
+          <w:rFonts w:ascii="Calibri" w:cs="Calibri" w:eastAsia="Calibri" w:hAnsi="Calibri"/>
+          <w:b w:val="false"/>
+          <w:bCs w:val="false"/>
+          <w:i w:val="false"/>
+          <w:iCs w:val="false"/>
+          <w:sz w:val="22"/>
+          <w:szCs w:val="22"/>
+        </w:rPr>
+        <w:t>Lưu ý: package scoring/ và adapter/ nằm trong service/ chứ không tách package riêng — vì vẫn thuộc tầng Service về mặt kiến trúc (đúng như stereotype «control» trong Sequence Diagram); adapter/ gom mọi lời gọi tới dịch vụ ngoài (AI, email, lưu trữ) sau interface provider để có thể đổi nhà cung cấp.</w:t>
+      </w:r>
+    </w:p>
+    <w:p>
+      <w:pPr>
+        <w:pStyle w:val="Heading1"/>
+        <w:keepNext/>
         <w:spacing w:after="150" w:before="340"/>
       </w:pPr>
       <w:r>
@@ -1981,10 +3727,442 @@
           </w:p>
         </w:tc>
       </w:tr>
+      <w:tr>
+        <w:tc>
+          <w:tcPr>
+            <w:tcW w:type="dxa" w:w="3000"/>
+            <w:tcMar>
+              <w:top w:type="dxa" w:w="70"/>
+              <w:left w:type="dxa" w:w="90"/>
+              <w:bottom w:type="dxa" w:w="70"/>
+              <w:right w:type="dxa" w:w="90"/>
+            </w:tcMar>
+          </w:tcPr>
+          <w:p>
+            <w:r>
+              <w:rPr>
+                <w:rFonts w:ascii="Calibri" w:cs="Calibri" w:eastAsia="Calibri" w:hAnsi="Calibri"/>
+                <w:b w:val="false"/>
+                <w:bCs w:val="false"/>
+                <w:sz w:val="20"/>
+                <w:szCs w:val="20"/>
+              </w:rPr>
+              <w:t>Job chấm điểm mất khi server khởi động lại (không dùng hàng đợi ngoài)</w:t>
+            </w:r>
+          </w:p>
+        </w:tc>
+        <w:tc>
+          <w:tcPr>
+            <w:tcW w:type="dxa" w:w="6000"/>
+            <w:tcMar>
+              <w:top w:type="dxa" w:w="70"/>
+              <w:left w:type="dxa" w:w="90"/>
+              <w:bottom w:type="dxa" w:w="70"/>
+              <w:right w:type="dxa" w:w="90"/>
+            </w:tcMar>
+          </w:tcPr>
+          <w:p>
+            <w:r>
+              <w:rPr>
+                <w:rFonts w:ascii="Calibri" w:cs="Calibri" w:eastAsia="Calibri" w:hAnsi="Calibri"/>
+                <w:b w:val="false"/>
+                <w:bCs w:val="false"/>
+                <w:sz w:val="20"/>
+                <w:szCs w:val="20"/>
+              </w:rPr>
+              <w:t>Khi khởi động, session PROCESSING quá hạn được đặt FAILED (SERVER_RESTART); người dùng bấm Chấm lại. Nếu cần bền hơn, nâng cấp lên hàng đợi (hướng phát triển)</w:t>
+            </w:r>
+          </w:p>
+        </w:tc>
+      </w:tr>
+      <w:tr>
+        <w:tc>
+          <w:tcPr>
+            <w:tcW w:type="dxa" w:w="3000"/>
+            <w:tcMar>
+              <w:top w:type="dxa" w:w="70"/>
+              <w:left w:type="dxa" w:w="90"/>
+              <w:bottom w:type="dxa" w:w="70"/>
+              <w:right w:type="dxa" w:w="90"/>
+            </w:tcMar>
+          </w:tcPr>
+          <w:p>
+            <w:r>
+              <w:rPr>
+                <w:rFonts w:ascii="Calibri" w:cs="Calibri" w:eastAsia="Calibri" w:hAnsi="Calibri"/>
+                <w:b w:val="false"/>
+                <w:bCs w:val="false"/>
+                <w:sz w:val="20"/>
+                <w:szCs w:val="20"/>
+              </w:rPr>
+              <w:t>Email đặt lại mật khẩu không gửi được (SMTP lỗi, hết hạn mức)</w:t>
+            </w:r>
+          </w:p>
+        </w:tc>
+        <w:tc>
+          <w:tcPr>
+            <w:tcW w:type="dxa" w:w="6000"/>
+            <w:tcMar>
+              <w:top w:type="dxa" w:w="70"/>
+              <w:left w:type="dxa" w:w="90"/>
+              <w:bottom w:type="dxa" w:w="70"/>
+              <w:right w:type="dxa" w:w="90"/>
+            </w:tcMar>
+          </w:tcPr>
+          <w:p>
+            <w:r>
+              <w:rPr>
+                <w:rFonts w:ascii="Calibri" w:cs="Calibri" w:eastAsia="Calibri" w:hAnsi="Calibri"/>
+                <w:b w:val="false"/>
+                <w:bCs w:val="false"/>
+                <w:sz w:val="20"/>
+                <w:szCs w:val="20"/>
+              </w:rPr>
+              <w:t>Không báo email có tồn tại hay không; ghi log; cho phép yêu cầu lại; có thể dùng dịch vụ SMTP miễn phí cho giai đoạn đồ án</w:t>
+            </w:r>
+          </w:p>
+        </w:tc>
+      </w:tr>
+      <w:tr>
+        <w:tc>
+          <w:tcPr>
+            <w:tcW w:type="dxa" w:w="3000"/>
+            <w:tcMar>
+              <w:top w:type="dxa" w:w="70"/>
+              <w:left w:type="dxa" w:w="90"/>
+              <w:bottom w:type="dxa" w:w="70"/>
+              <w:right w:type="dxa" w:w="90"/>
+            </w:tcMar>
+          </w:tcPr>
+          <w:p>
+            <w:r>
+              <w:rPr>
+                <w:rFonts w:ascii="Calibri" w:cs="Calibri" w:eastAsia="Calibri" w:hAnsi="Calibri"/>
+                <w:b w:val="false"/>
+                <w:bCs w:val="false"/>
+                <w:sz w:val="20"/>
+                <w:szCs w:val="20"/>
+              </w:rPr>
+              <w:t>Polling của client tạo tải không cần thiết</w:t>
+            </w:r>
+          </w:p>
+        </w:tc>
+        <w:tc>
+          <w:tcPr>
+            <w:tcW w:type="dxa" w:w="6000"/>
+            <w:tcMar>
+              <w:top w:type="dxa" w:w="70"/>
+              <w:left w:type="dxa" w:w="90"/>
+              <w:bottom w:type="dxa" w:w="70"/>
+              <w:right w:type="dxa" w:w="90"/>
+            </w:tcMar>
+          </w:tcPr>
+          <w:p>
+            <w:r>
+              <w:rPr>
+                <w:rFonts w:ascii="Calibri" w:cs="Calibri" w:eastAsia="Calibri" w:hAnsi="Calibri"/>
+                <w:b w:val="false"/>
+                <w:bCs w:val="false"/>
+                <w:sz w:val="20"/>
+                <w:szCs w:val="20"/>
+              </w:rPr>
+              <w:t>Polling mỗi 2 giây chỉ khi phiên PROCESSING; dừng khi SCORED/FAILED; cân nhắc tăng dần khoảng cách</w:t>
+            </w:r>
+          </w:p>
+        </w:tc>
+      </w:tr>
     </w:tbl>
+    <w:p>
+      <w:pPr>
+        <w:sectPr>
+          <w:pgSz w:w="11906" w:h="16838" w:orient="portrait"/>
+          <w:pgMar w:top="1134" w:right="1134" w:bottom="1134" w:left="1134" w:header="708" w:footer="708" w:gutter="0"/>
+          <w:pgNumType/>
+          <w:docGrid w:linePitch="360"/>
+        </w:sectPr>
+      </w:pPr>
+    </w:p>
+    <w:p>
+      <w:pPr>
+        <w:pStyle w:val="Heading1"/>
+        <w:keepNext/>
+        <w:spacing w:after="150" w:before="340"/>
+      </w:pPr>
+      <w:r>
+        <w:rPr>
+          <w:rFonts w:ascii="Calibri" w:cs="Calibri" w:eastAsia="Calibri" w:hAnsi="Calibri"/>
+          <w:b/>
+          <w:bCs/>
+          <w:color w:val="1F4E79"/>
+          <w:sz w:val="28"/>
+          <w:szCs w:val="28"/>
+        </w:rPr>
+        <w:t>Phụ lục A. Các sơ đồ kiến trúc</w:t>
+      </w:r>
+    </w:p>
+    <w:p>
+      <w:r>
+        <w:rPr>
+          <w:b/>
+          <w:sz w:val="22"/>
+        </w:rPr>
+        <w:t>Hình 1. Kiến trúc tổng thể</w:t>
+      </w:r>
+    </w:p>
+    <w:p>
+      <w:pPr>
+        <w:jc w:val="center"/>
+      </w:pPr>
+      <w:r>
+        <w:drawing>
+          <wp:inline xmlns:a="http://schemas.openxmlformats.org/drawingml/2006/main" xmlns:pic="http://schemas.openxmlformats.org/drawingml/2006/picture">
+            <wp:extent cx="9360000" cy="5044675"/>
+            <wp:docPr id="1" name="Picture 1"/>
+            <wp:cNvGraphicFramePr>
+              <a:graphicFrameLocks noChangeAspect="1"/>
+            </wp:cNvGraphicFramePr>
+            <a:graphic>
+              <a:graphicData uri="http://schemas.openxmlformats.org/drawingml/2006/picture">
+                <pic:pic>
+                  <pic:nvPicPr>
+                    <pic:cNvPr id="0" name="architecture-1.png"/>
+                    <pic:cNvPicPr/>
+                  </pic:nvPicPr>
+                  <pic:blipFill>
+                    <a:blip r:embed="rId8"/>
+                    <a:stretch>
+                      <a:fillRect/>
+                    </a:stretch>
+                  </pic:blipFill>
+                  <pic:spPr>
+                    <a:xfrm>
+                      <a:off x="0" y="0"/>
+                      <a:ext cx="9360000" cy="5044675"/>
+                    </a:xfrm>
+                    <a:prstGeom prst="rect"/>
+                  </pic:spPr>
+                </pic:pic>
+              </a:graphicData>
+            </a:graphic>
+          </wp:inline>
+        </w:drawing>
+      </w:r>
+    </w:p>
+    <w:p>
+      <w:r>
+        <w:br w:type="page"/>
+      </w:r>
+    </w:p>
+    <w:p>
+      <w:r>
+        <w:rPr>
+          <w:b/>
+          <w:sz w:val="22"/>
+        </w:rPr>
+        <w:t>Hình 2. Thành phần theo tầng</w:t>
+      </w:r>
+    </w:p>
+    <w:p>
+      <w:pPr>
+        <w:jc w:val="center"/>
+      </w:pPr>
+      <w:r>
+        <w:drawing>
+          <wp:inline xmlns:a="http://schemas.openxmlformats.org/drawingml/2006/main" xmlns:pic="http://schemas.openxmlformats.org/drawingml/2006/picture">
+            <wp:extent cx="8402502" cy="5472000"/>
+            <wp:docPr id="2" name="Picture 2"/>
+            <wp:cNvGraphicFramePr>
+              <a:graphicFrameLocks noChangeAspect="1"/>
+            </wp:cNvGraphicFramePr>
+            <a:graphic>
+              <a:graphicData uri="http://schemas.openxmlformats.org/drawingml/2006/picture">
+                <pic:pic>
+                  <pic:nvPicPr>
+                    <pic:cNvPr id="0" name="architecture-2.png"/>
+                    <pic:cNvPicPr/>
+                  </pic:nvPicPr>
+                  <pic:blipFill>
+                    <a:blip r:embed="rId9"/>
+                    <a:stretch>
+                      <a:fillRect/>
+                    </a:stretch>
+                  </pic:blipFill>
+                  <pic:spPr>
+                    <a:xfrm>
+                      <a:off x="0" y="0"/>
+                      <a:ext cx="8402502" cy="5472000"/>
+                    </a:xfrm>
+                    <a:prstGeom prst="rect"/>
+                  </pic:spPr>
+                </pic:pic>
+              </a:graphicData>
+            </a:graphic>
+          </wp:inline>
+        </w:drawing>
+      </w:r>
+    </w:p>
+    <w:p>
+      <w:r>
+        <w:br w:type="page"/>
+      </w:r>
+    </w:p>
+    <w:p>
+      <w:r>
+        <w:rPr>
+          <w:b/>
+          <w:sz w:val="22"/>
+        </w:rPr>
+        <w:t>Hình 3. Sơ đồ triển khai</w:t>
+      </w:r>
+    </w:p>
+    <w:p>
+      <w:pPr>
+        <w:jc w:val="center"/>
+      </w:pPr>
+      <w:r>
+        <w:drawing>
+          <wp:inline xmlns:a="http://schemas.openxmlformats.org/drawingml/2006/main" xmlns:pic="http://schemas.openxmlformats.org/drawingml/2006/picture">
+            <wp:extent cx="7904000" cy="5472000"/>
+            <wp:docPr id="3" name="Picture 3"/>
+            <wp:cNvGraphicFramePr>
+              <a:graphicFrameLocks noChangeAspect="1"/>
+            </wp:cNvGraphicFramePr>
+            <a:graphic>
+              <a:graphicData uri="http://schemas.openxmlformats.org/drawingml/2006/picture">
+                <pic:pic>
+                  <pic:nvPicPr>
+                    <pic:cNvPr id="0" name="architecture-3.png"/>
+                    <pic:cNvPicPr/>
+                  </pic:nvPicPr>
+                  <pic:blipFill>
+                    <a:blip r:embed="rId10"/>
+                    <a:stretch>
+                      <a:fillRect/>
+                    </a:stretch>
+                  </pic:blipFill>
+                  <pic:spPr>
+                    <a:xfrm>
+                      <a:off x="0" y="0"/>
+                      <a:ext cx="7904000" cy="5472000"/>
+                    </a:xfrm>
+                    <a:prstGeom prst="rect"/>
+                  </pic:spPr>
+                </pic:pic>
+              </a:graphicData>
+            </a:graphic>
+          </wp:inline>
+        </w:drawing>
+      </w:r>
+    </w:p>
+    <w:p>
+      <w:r>
+        <w:br w:type="page"/>
+      </w:r>
+    </w:p>
+    <w:p>
+      <w:r>
+        <w:rPr>
+          <w:b/>
+          <w:sz w:val="22"/>
+        </w:rPr>
+        <w:t>Hình 4. Luồng chấm điểm bất đồng bộ</w:t>
+      </w:r>
+    </w:p>
+    <w:p>
+      <w:pPr>
+        <w:jc w:val="center"/>
+      </w:pPr>
+      <w:r>
+        <w:drawing>
+          <wp:inline xmlns:a="http://schemas.openxmlformats.org/drawingml/2006/main" xmlns:pic="http://schemas.openxmlformats.org/drawingml/2006/picture">
+            <wp:extent cx="7950349" cy="5471999"/>
+            <wp:docPr id="4" name="Picture 4"/>
+            <wp:cNvGraphicFramePr>
+              <a:graphicFrameLocks noChangeAspect="1"/>
+            </wp:cNvGraphicFramePr>
+            <a:graphic>
+              <a:graphicData uri="http://schemas.openxmlformats.org/drawingml/2006/picture">
+                <pic:pic>
+                  <pic:nvPicPr>
+                    <pic:cNvPr id="0" name="architecture-4.png"/>
+                    <pic:cNvPicPr/>
+                  </pic:nvPicPr>
+                  <pic:blipFill>
+                    <a:blip r:embed="rId11"/>
+                    <a:stretch>
+                      <a:fillRect/>
+                    </a:stretch>
+                  </pic:blipFill>
+                  <pic:spPr>
+                    <a:xfrm>
+                      <a:off x="0" y="0"/>
+                      <a:ext cx="7950349" cy="5471999"/>
+                    </a:xfrm>
+                    <a:prstGeom prst="rect"/>
+                  </pic:spPr>
+                </pic:pic>
+              </a:graphicData>
+            </a:graphic>
+          </wp:inline>
+        </w:drawing>
+      </w:r>
+    </w:p>
+    <w:p>
+      <w:r>
+        <w:br w:type="page"/>
+      </w:r>
+    </w:p>
+    <w:p>
+      <w:r>
+        <w:rPr>
+          <w:b/>
+          <w:sz w:val="22"/>
+        </w:rPr>
+        <w:t>Hình 5. Bảo mật JWT / RBAC</w:t>
+      </w:r>
+    </w:p>
+    <w:p>
+      <w:pPr>
+        <w:jc w:val="center"/>
+      </w:pPr>
+      <w:r>
+        <w:drawing>
+          <wp:inline xmlns:a="http://schemas.openxmlformats.org/drawingml/2006/main" xmlns:pic="http://schemas.openxmlformats.org/drawingml/2006/picture">
+            <wp:extent cx="8925470" cy="5472000"/>
+            <wp:docPr id="5" name="Picture 5"/>
+            <wp:cNvGraphicFramePr>
+              <a:graphicFrameLocks noChangeAspect="1"/>
+            </wp:cNvGraphicFramePr>
+            <a:graphic>
+              <a:graphicData uri="http://schemas.openxmlformats.org/drawingml/2006/picture">
+                <pic:pic>
+                  <pic:nvPicPr>
+                    <pic:cNvPr id="0" name="architecture-5.png"/>
+                    <pic:cNvPicPr/>
+                  </pic:nvPicPr>
+                  <pic:blipFill>
+                    <a:blip r:embed="rId12"/>
+                    <a:stretch>
+                      <a:fillRect/>
+                    </a:stretch>
+                  </pic:blipFill>
+                  <pic:spPr>
+                    <a:xfrm>
+                      <a:off x="0" y="0"/>
+                      <a:ext cx="8925470" cy="5472000"/>
+                    </a:xfrm>
+                    <a:prstGeom prst="rect"/>
+                  </pic:spPr>
+                </pic:pic>
+              </a:graphicData>
+            </a:graphic>
+          </wp:inline>
+        </w:drawing>
+      </w:r>
+    </w:p>
     <w:sectPr>
-      <w:pgSz w:w="11906" w:h="16838" w:orient="portrait"/>
-      <w:pgMar w:top="1134" w:right="1134" w:bottom="1134" w:left="1134" w:header="708" w:footer="708" w:gutter="0"/>
+      <w:pgSz w:w="16838" w:h="11906" w:orient="landscape"/>
+      <w:pgMar w:top="850" w:right="850" w:bottom="850" w:left="850" w:header="708" w:footer="708" w:gutter="0"/>
       <w:pgNumType/>
       <w:docGrid w:linePitch="360"/>
     </w:sectPr>

</xml_diff>